<commit_message>
full stack quan ly bai hoc
</commit_message>
<xml_diff>
--- a/doAnTotNghiep.docx
+++ b/doAnTotNghiep.docx
@@ -9216,6 +9216,7 @@
         <w:jc w:val="both"/>
         <w:rPr>
           <w:rFonts w:eastAsia="Times New Roman" w:cs="Times New Roman"/>
+          <w:lang w:val="en-US"/>
         </w:rPr>
       </w:pPr>
       <w:r>
@@ -9223,6 +9224,103 @@
           <w:rFonts w:eastAsia="Times New Roman" w:cs="Times New Roman"/>
         </w:rPr>
         <w:t>Tuy nhiên, hiện nay chưa có nhiều hệ thống tích hợp đầy đủ các chức năng như học theo lộ trình, học qua video ngữ cảnh, tra cứu từ vựng theo ngữ cảnh, luyện phát âm và lớp học trực tuyến trong cùng một hệ thống. Vì vậy, việc xây dựng một hệ thống hỗ trợ học tiếng Việt cho người nước ngoài là cần thiết nhằm đáp ứng nhu cầu học tập và giúp người học học tiếng Việt một cách hiệu quả hơn.</w:t>
+      </w:r>
+    </w:p>
+    <w:p>
+      <w:pPr>
+        <w:spacing w:before="100" w:beforeAutospacing="1" w:after="100" w:afterAutospacing="1" w:line="240" w:lineRule="auto"/>
+        <w:ind w:firstLine="420"/>
+        <w:jc w:val="both"/>
+        <w:rPr>
+          <w:rFonts w:eastAsia="Times New Roman" w:cs="Times New Roman"/>
+          <w:lang w:val="en-US"/>
+        </w:rPr>
+      </w:pPr>
+      <w:r>
+        <w:rPr>
+          <w:rFonts w:eastAsia="Times New Roman" w:cs="Times New Roman"/>
+          <w:lang w:val="en-US"/>
+        </w:rPr>
+        <w:t>Từ những thực trạng trên, có thể thấy rằng người học tiếng Việt không chỉ cần trau dồi từ vựng, ngữ pháp mà còn có nhu cầu cấp thiết trong việc luyện nghe, luyện nói và phản xạ phát âm trong các tình huống giao tiếp thực tế. Người học cần một hệ thống học tập toàn diện, hỗ trợ học theo lộ trình bài bản, cung cấp video hội thoại đời sống, cho phép tra cứu từ vựng theo ngữ cảnh và tích hợp môi trường tương tác trực tuyến.</w:t>
+      </w:r>
+    </w:p>
+    <w:p>
+      <w:pPr>
+        <w:spacing w:before="100" w:beforeAutospacing="1" w:after="100" w:afterAutospacing="1" w:line="240" w:lineRule="auto"/>
+        <w:ind w:firstLine="420"/>
+        <w:jc w:val="both"/>
+        <w:rPr>
+          <w:rFonts w:eastAsia="Times New Roman" w:cs="Times New Roman"/>
+          <w:lang w:val="en-US"/>
+        </w:rPr>
+      </w:pPr>
+      <w:r>
+        <w:rPr>
+          <w:rFonts w:eastAsia="Times New Roman" w:cs="Times New Roman"/>
+          <w:lang w:val="en-US"/>
+        </w:rPr>
+        <w:lastRenderedPageBreak/>
+        <w:t>Để đáp ứng nhu cầu đó một cách khoa học nhất, hệ thống website được đề xuất xây dựng dựa trên các tiêu chuẩn sư phạm chính thống:</w:t>
+      </w:r>
+    </w:p>
+    <w:p>
+      <w:pPr>
+        <w:numPr>
+          <w:ilvl w:val="0"/>
+          <w:numId w:val="60"/>
+        </w:numPr>
+        <w:spacing w:before="100" w:beforeAutospacing="1" w:after="100" w:afterAutospacing="1" w:line="240" w:lineRule="auto"/>
+        <w:jc w:val="both"/>
+        <w:rPr>
+          <w:rFonts w:eastAsia="Times New Roman" w:cs="Times New Roman"/>
+          <w:lang w:val="en-US"/>
+        </w:rPr>
+      </w:pPr>
+      <w:r>
+        <w:rPr>
+          <w:rFonts w:eastAsia="Times New Roman" w:cs="Times New Roman"/>
+          <w:lang w:val="en-US"/>
+        </w:rPr>
+        <w:t>Về khung năng lực: Hệ thống bám sát Thông tư số 17/2015/TT-BGDĐT của Bộ Giáo dục và Đào tạo về việc ban hành "Khung năng lực tiếng Việt dùng cho người nước ngoài". Việc này giúp người học được đào tạo theo lộ trình 6 bậc chuẩn quốc gia (A1 đến C2), đảm bảo kiến thức có tính kế thừa và công nhận rộng rãi.</w:t>
+      </w:r>
+    </w:p>
+    <w:p>
+      <w:pPr>
+        <w:numPr>
+          <w:ilvl w:val="0"/>
+          <w:numId w:val="60"/>
+        </w:numPr>
+        <w:spacing w:before="100" w:beforeAutospacing="1" w:after="100" w:afterAutospacing="1" w:line="240" w:lineRule="auto"/>
+        <w:jc w:val="both"/>
+        <w:rPr>
+          <w:rFonts w:eastAsia="Times New Roman" w:cs="Times New Roman"/>
+          <w:lang w:val="en-US"/>
+        </w:rPr>
+      </w:pPr>
+      <w:r>
+        <w:rPr>
+          <w:rFonts w:eastAsia="Times New Roman" w:cs="Times New Roman"/>
+          <w:lang w:val="en-US"/>
+        </w:rPr>
+        <w:t>Về học liệu: Các chủ điểm bài học và nội dung giáo trình được tham chiếu từ bộ "Tiếng Việt cho người nước ngoài" (VSL) của Trường ĐH KHXH&amp;NV - ĐHQG TP.HCM và bộ "Tiếng Việt Cơ Sở" (Nguyễn Anh Quế, Nguyễn Việt Hương). Đây là những nguồn học liệu uy tín, giúp hệ thống cung cấp các tình huống giao tiếp thực tế và ngữ pháp chuẩn xác.</w:t>
+      </w:r>
+    </w:p>
+    <w:p>
+      <w:pPr>
+        <w:spacing w:before="100" w:beforeAutospacing="1" w:after="100" w:afterAutospacing="1" w:line="240" w:lineRule="auto"/>
+        <w:ind w:firstLine="420"/>
+        <w:jc w:val="both"/>
+        <w:rPr>
+          <w:rFonts w:eastAsia="Times New Roman" w:cs="Times New Roman"/>
+          <w:lang w:val="en-US"/>
+        </w:rPr>
+      </w:pPr>
+      <w:r>
+        <w:rPr>
+          <w:rFonts w:eastAsia="Times New Roman" w:cs="Times New Roman"/>
+          <w:lang w:val="en-US"/>
+        </w:rPr>
+        <w:t>Tuy nhiên, hiện nay chưa có nhiều hệ thống tích hợp đầy đủ các chức năng như học theo lộ trình chuẩn, học qua video ngữ cảnh và luyện phát âm có phản hồi trong cùng một nền tảng. Vì vậy, việc xây dựng hệ thống hỗ trợ học tiếng Việt cho người nước ngoài theo định hướng này là vô cùng cần thiết nhằm nâng cao hiệu quả học tập cho cộng đồng người nước ngoài tại Việt Nam</w:t>
       </w:r>
     </w:p>
     <w:p>
@@ -9255,15 +9353,7 @@
           <w:rFonts w:cs="Times New Roman"/>
           <w:szCs w:val="26"/>
         </w:rPr>
-        <w:t xml:space="preserve">Sau khi áp dụng các phương pháp thu thập yêu cầu như phỏng vấn người dùng, khảo sát bằng phiếu điều tra và khảo sát các hệ thống tương tự, các thông tin thu được đã được </w:t>
-      </w:r>
-      <w:r>
-        <w:rPr>
-          <w:rFonts w:cs="Times New Roman"/>
-          <w:szCs w:val="26"/>
-        </w:rPr>
-        <w:lastRenderedPageBreak/>
-        <w:t>tổng hợp và phân tích. Kết quả tổng hợp được phân loại theo từng lĩnh vực nghiệp vụ và được trình bày trong bảng dưới đây.</w:t>
+        <w:t>Sau khi áp dụng các phương pháp thu thập yêu cầu như phỏng vấn người dùng, khảo sát bằng phiếu điều tra và khảo sát các hệ thống tương tự, các thông tin thu được đã được tổng hợp và phân tích. Kết quả tổng hợp được phân loại theo từng lĩnh vực nghiệp vụ và được trình bày trong bảng dưới đây.</w:t>
       </w:r>
     </w:p>
     <w:p>
@@ -9704,6 +9794,7 @@
                 <w:bCs/>
                 <w:szCs w:val="26"/>
               </w:rPr>
+              <w:lastRenderedPageBreak/>
               <w:t>Luyện nói</w:t>
             </w:r>
           </w:p>
@@ -10082,7 +10173,6 @@
           <w:rFonts w:cs="Times New Roman"/>
           <w:szCs w:val="26"/>
         </w:rPr>
-        <w:lastRenderedPageBreak/>
         <w:t>Hiển thị các câu thoại chứa từ tìm kiếm kèm theo video tại đúng thời điểm câu thoại xuất hiện</w:t>
       </w:r>
       <w:r>
@@ -10244,7 +10334,15 @@
           <w:rFonts w:cs="Times New Roman"/>
           <w:szCs w:val="26"/>
         </w:rPr>
-        <w:t>Hệ thống website học tiếng Việt cho người nước ngoài bao gồm hai phân hệ chính: phân hệ học theo lộ trình và phân hệ học theo ngữ cảnh giao tiếp thực tế. Phân hệ học theo lộ trình cung cấp các khóa học, bài học, video bài giảng và bài kiểm tra nhằm giúp người học học tiếng Việt theo từng cấp độ từ cơ bản đến nâng cao. Phân hệ học theo ngữ cảnh giao tiếp thực tế cho phép người học tra cứu từ vựng trong video, học qua các câu hội thoại thực tế, luyện nghe, luyện nói và luyện phát âm tiếng Việt. Ngoài ra, hệ thống còn hỗ trợ lớp học trực tuyến thông qua Zoom, cho phép người học xem lịch học, đăng ký lớp học và tham gia lớp học trực tuyến với giáo viên</w:t>
+        <w:t xml:space="preserve">Hệ thống website học tiếng Việt cho người nước ngoài bao gồm hai phân hệ chính: phân hệ học theo lộ trình và phân hệ học theo ngữ cảnh giao tiếp thực tế. Phân hệ học theo lộ trình cung cấp các khóa học, bài học, video bài giảng và bài kiểm tra nhằm giúp người học học tiếng Việt theo từng cấp độ từ cơ bản đến nâng cao. Phân hệ học theo ngữ cảnh </w:t>
+      </w:r>
+      <w:r>
+        <w:rPr>
+          <w:rFonts w:cs="Times New Roman"/>
+          <w:szCs w:val="26"/>
+        </w:rPr>
+        <w:lastRenderedPageBreak/>
+        <w:t>giao tiếp thực tế cho phép người học tra cứu từ vựng trong video, học qua các câu hội thoại thực tế, luyện nghe, luyện nói và luyện phát âm tiếng Việt. Ngoài ra, hệ thống còn hỗ trợ lớp học trực tuyến thông qua Zoom, cho phép người học xem lịch học, đăng ký lớp học và tham gia lớp học trực tuyến với giáo viên</w:t>
       </w:r>
       <w:r>
         <w:rPr>
@@ -10600,7 +10698,6 @@
           <w:sz w:val="26"/>
           <w:szCs w:val="26"/>
         </w:rPr>
-        <w:lastRenderedPageBreak/>
         <w:t xml:space="preserve">Người học có thể học bài theo thứ tự của khóa học. </w:t>
       </w:r>
     </w:p>
@@ -11014,6 +11111,7 @@
           <w:sz w:val="26"/>
           <w:szCs w:val="26"/>
         </w:rPr>
+        <w:lastRenderedPageBreak/>
         <w:t xml:space="preserve">Người học có thể ghi âm giọng nói khi đọc theo câu mẫu. </w:t>
       </w:r>
     </w:p>
@@ -11486,7 +11584,6 @@
           <w:sz w:val="26"/>
           <w:szCs w:val="26"/>
         </w:rPr>
-        <w:lastRenderedPageBreak/>
         <w:t xml:space="preserve">Quản trị viên có thể quản lý câu hỏi bài kiểm tra. </w:t>
       </w:r>
     </w:p>
@@ -11728,6 +11825,7 @@
           <w:szCs w:val="26"/>
           <w:lang w:val="vi-VN"/>
         </w:rPr>
+        <w:lastRenderedPageBreak/>
         <w:t>Kết quả tra cứu từ vựng phải chính xác và hiển thị đúng nghĩa, ví dụ minh họa và video liên quan</w:t>
       </w:r>
       <w:r>
@@ -12156,7 +12254,6 @@
           <w:szCs w:val="26"/>
           <w:lang w:val="vi-VN"/>
         </w:rPr>
-        <w:lastRenderedPageBreak/>
         <w:t>Yêu cầu về tính tương thích</w:t>
       </w:r>
       <w:r>
@@ -12450,6 +12547,7 @@
           <w:szCs w:val="26"/>
           <w:lang w:val="vi-VN"/>
         </w:rPr>
+        <w:lastRenderedPageBreak/>
         <w:t>Trong trường hợp xảy ra lỗi, hệ thống cần có thông báo phù hợp để người dùng dễ nhận biết và xử lý</w:t>
       </w:r>
       <w:r>
@@ -12676,11 +12774,7 @@
               </w:rPr>
             </w:pPr>
             <w:r>
-              <w:t xml:space="preserve">Google Forms được sử dụng để xây dựng các biểu mẫu khảo sát nhằm thu thập ý kiến của người dùng mục tiêu. Công cụ này cho phép tạo các câu hỏi dưới nhiều dạng khác nhau như câu hỏi trắc nghiệm, câu hỏi tự luận và câu hỏi thang đo đánh giá. Ngoài ra, Google Forms còn hỗ trợ tổng hợp kết quả khảo sát dưới dạng biểu đồ và bảng thống kê, giúp dễ dàng </w:t>
-            </w:r>
-            <w:r>
-              <w:lastRenderedPageBreak/>
-              <w:t>phân tích nhu cầu người dùng và xác định các yêu cầu của hệ thống.</w:t>
+              <w:t>Google Forms được sử dụng để xây dựng các biểu mẫu khảo sát nhằm thu thập ý kiến của người dùng mục tiêu. Công cụ này cho phép tạo các câu hỏi dưới nhiều dạng khác nhau như câu hỏi trắc nghiệm, câu hỏi tự luận và câu hỏi thang đo đánh giá. Ngoài ra, Google Forms còn hỗ trợ tổng hợp kết quả khảo sát dưới dạng biểu đồ và bảng thống kê, giúp dễ dàng phân tích nhu cầu người dùng và xác định các yêu cầu của hệ thống.</w:t>
             </w:r>
           </w:p>
         </w:tc>
@@ -12702,7 +12796,6 @@
                 <w:noProof/>
                 <w:lang w:val="en-US"/>
               </w:rPr>
-              <w:lastRenderedPageBreak/>
               <w:drawing>
                 <wp:inline distT="0" distB="0" distL="0" distR="0" wp14:anchorId="03745361" wp14:editId="2389A496">
                   <wp:extent cx="2152650" cy="1638300"/>
@@ -12775,6 +12868,7 @@
                 <w:noProof/>
                 <w:lang w:val="en-US"/>
               </w:rPr>
+              <w:lastRenderedPageBreak/>
               <w:drawing>
                 <wp:inline distT="0" distB="0" distL="0" distR="0" wp14:anchorId="72A6C8C4" wp14:editId="0370FA12">
                   <wp:extent cx="2152650" cy="1857375"/>
@@ -12997,7 +13091,6 @@
                 <w:noProof/>
                 <w:lang w:val="en-US"/>
               </w:rPr>
-              <w:lastRenderedPageBreak/>
               <w:drawing>
                 <wp:inline distT="0" distB="0" distL="0" distR="0" wp14:anchorId="27C088AD" wp14:editId="178BC335">
                   <wp:extent cx="2162175" cy="2152650"/>
@@ -13070,6 +13163,7 @@
                 <w:noProof/>
                 <w:lang w:val="en-US"/>
               </w:rPr>
+              <w:lastRenderedPageBreak/>
               <w:drawing>
                 <wp:inline distT="0" distB="0" distL="0" distR="0" wp14:anchorId="25A06466" wp14:editId="50C24572">
                   <wp:extent cx="2171700" cy="1162050"/>
@@ -13263,14 +13357,7 @@
         <w:rPr>
           <w:rFonts w:eastAsia="Times New Roman" w:cs="Times New Roman"/>
         </w:rPr>
-        <w:t xml:space="preserve">Theo mô hình gia tăng, mỗi Increment được phát triển như một chu trình phát triển phần mềm thu nhỏ, bao gồm các bước như phân tích yêu cầu, thiết kế, cài đặt, kiểm thử và triển khai. Sau khi hoàn thành một Increment, chức năng mới sẽ được tích hợp vào hệ thống hiện có và tiếp tục phát triển các Increment tiếp theo cho đến khi hoàn thành toàn bộ hệ </w:t>
-      </w:r>
-      <w:r>
-        <w:rPr>
-          <w:rFonts w:eastAsia="Times New Roman" w:cs="Times New Roman"/>
-        </w:rPr>
-        <w:lastRenderedPageBreak/>
-        <w:t>thống. Mô hình này cho phép hệ thống có thể hoạt động sớm với các chức năng cơ bản và tiếp tục được mở rộng ở các giai đoạn sau.</w:t>
+        <w:t>Theo mô hình gia tăng, mỗi Increment được phát triển như một chu trình phát triển phần mềm thu nhỏ, bao gồm các bước như phân tích yêu cầu, thiết kế, cài đặt, kiểm thử và triển khai. Sau khi hoàn thành một Increment, chức năng mới sẽ được tích hợp vào hệ thống hiện có và tiếp tục phát triển các Increment tiếp theo cho đến khi hoàn thành toàn bộ hệ thống. Mô hình này cho phép hệ thống có thể hoạt động sớm với các chức năng cơ bản và tiếp tục được mở rộng ở các giai đoạn sau.</w:t>
       </w:r>
     </w:p>
     <w:p>
@@ -13486,6 +13573,7 @@
           <w:sz w:val="26"/>
           <w:szCs w:val="26"/>
         </w:rPr>
+        <w:lastRenderedPageBreak/>
         <w:t xml:space="preserve">Cài đặt: Lập trình và xây dựng chức năng. </w:t>
       </w:r>
     </w:p>
@@ -14834,16 +14922,7 @@
           <w:bCs/>
           <w:szCs w:val="26"/>
         </w:rPr>
-        <w:t xml:space="preserve">Việc áp dụng mô hình phát triển phần mềm gia tăng giúp hệ thống được xây dựng theo từng giai đoạn, đảm bảo mỗi giai đoạn đều có sản phẩm cụ thể và có thể kiểm thử </w:t>
-      </w:r>
-      <w:r>
-        <w:rPr>
-          <w:rFonts w:eastAsia="Calibri" w:cs="Times New Roman"/>
-          <w:bCs/>
-          <w:szCs w:val="26"/>
-        </w:rPr>
-        <w:lastRenderedPageBreak/>
-        <w:t>được. Điều này giúp giảm rủi ro trong quá trình phát triển, đồng thời giúp hệ thống có thể điều chỉnh và bổ sung chức năng phù hợp với yêu cầu thực tế trong quá trình thực hiện đề tài</w:t>
+        <w:t>Việc áp dụng mô hình phát triển phần mềm gia tăng giúp hệ thống được xây dựng theo từng giai đoạn, đảm bảo mỗi giai đoạn đều có sản phẩm cụ thể và có thể kiểm thử được. Điều này giúp giảm rủi ro trong quá trình phát triển, đồng thời giúp hệ thống có thể điều chỉnh và bổ sung chức năng phù hợp với yêu cầu thực tế trong quá trình thực hiện đề tài</w:t>
       </w:r>
       <w:r>
         <w:rPr>
@@ -18665,6 +18744,15 @@
               </w:rPr>
               <w:t>Youtube</w:t>
             </w:r>
+            <w:r>
+              <w:rPr>
+                <w:rFonts w:eastAsia="Calibri" w:cs="Times New Roman"/>
+                <w:bCs/>
+                <w:szCs w:val="26"/>
+                <w:lang w:val="en-US"/>
+              </w:rPr>
+              <w:t>Id</w:t>
+            </w:r>
           </w:p>
         </w:tc>
         <w:tc>
@@ -19780,7 +19868,25 @@
           <w:sz w:val="26"/>
           <w:szCs w:val="26"/>
         </w:rPr>
-        <w:t>Bảng Levels</w:t>
+        <w:t xml:space="preserve">Bảng </w:t>
+      </w:r>
+      <w:r>
+        <w:rPr>
+          <w:rFonts w:ascii="Times New Roman" w:eastAsia="Calibri" w:hAnsi="Times New Roman" w:cs="Times New Roman"/>
+          <w:bCs/>
+          <w:sz w:val="26"/>
+          <w:szCs w:val="26"/>
+        </w:rPr>
+        <w:t>Level</w:t>
+      </w:r>
+      <w:r>
+        <w:rPr>
+          <w:rFonts w:ascii="Times New Roman" w:eastAsia="Calibri" w:hAnsi="Times New Roman" w:cs="Times New Roman"/>
+          <w:bCs/>
+          <w:sz w:val="26"/>
+          <w:szCs w:val="26"/>
+        </w:rPr>
+        <w:t>s</w:t>
       </w:r>
     </w:p>
     <w:tbl>
@@ -19946,7 +20052,16 @@
                 <w:szCs w:val="26"/>
                 <w:lang w:val="en-US"/>
               </w:rPr>
-              <w:t>LevelId</w:t>
+              <w:t>Level</w:t>
+            </w:r>
+            <w:r>
+              <w:rPr>
+                <w:rFonts w:eastAsia="Calibri" w:cs="Times New Roman"/>
+                <w:bCs/>
+                <w:szCs w:val="26"/>
+                <w:lang w:val="en-US"/>
+              </w:rPr>
+              <w:t>Id</w:t>
             </w:r>
           </w:p>
         </w:tc>
@@ -19972,25 +20087,7 @@
                 <w:szCs w:val="26"/>
                 <w:lang w:val="en-US"/>
               </w:rPr>
-              <w:t>I</w:t>
-            </w:r>
-            <w:r>
-              <w:rPr>
-                <w:rFonts w:eastAsia="Calibri" w:cs="Times New Roman"/>
-                <w:bCs/>
-                <w:szCs w:val="26"/>
-                <w:lang w:val="en-US"/>
-              </w:rPr>
-              <w:t>nt</w:t>
-            </w:r>
-            <w:r>
-              <w:rPr>
-                <w:rFonts w:eastAsia="Calibri" w:cs="Times New Roman"/>
-                <w:bCs/>
-                <w:szCs w:val="26"/>
-                <w:lang w:val="en-US"/>
-              </w:rPr>
-              <w:t xml:space="preserve"> </w:t>
+              <w:t xml:space="preserve">Int </w:t>
             </w:r>
           </w:p>
         </w:tc>
@@ -20016,25 +20113,7 @@
                 <w:szCs w:val="26"/>
                 <w:lang w:val="en-US"/>
               </w:rPr>
-              <w:t xml:space="preserve">Mã </w:t>
-            </w:r>
-            <w:r>
-              <w:rPr>
-                <w:rFonts w:eastAsia="Calibri" w:cs="Times New Roman"/>
-                <w:bCs/>
-                <w:szCs w:val="26"/>
-                <w:lang w:val="en-US"/>
-              </w:rPr>
-              <w:t>cấp</w:t>
-            </w:r>
-            <w:r>
-              <w:rPr>
-                <w:rFonts w:eastAsia="Calibri" w:cs="Times New Roman"/>
-                <w:bCs/>
-                <w:szCs w:val="26"/>
-                <w:lang w:val="en-US"/>
-              </w:rPr>
-              <w:t xml:space="preserve"> độ</w:t>
+              <w:t>Mã khóa học</w:t>
             </w:r>
           </w:p>
         </w:tc>
@@ -21344,7 +21423,7 @@
                 <w:szCs w:val="26"/>
                 <w:lang w:val="en-US"/>
               </w:rPr>
-              <w:t xml:space="preserve">Int </w:t>
+              <w:t>Nvarchar(255)</w:t>
             </w:r>
           </w:p>
         </w:tc>
@@ -21559,7 +21638,26 @@
           <w:sz w:val="26"/>
           <w:szCs w:val="26"/>
         </w:rPr>
-        <w:t>Bảng Lessons</w:t>
+        <w:t xml:space="preserve">Bảng </w:t>
+      </w:r>
+      <w:r>
+        <w:rPr>
+          <w:rFonts w:ascii="Times New Roman" w:eastAsia="Calibri" w:hAnsi="Times New Roman" w:cs="Times New Roman"/>
+          <w:bCs/>
+          <w:sz w:val="26"/>
+          <w:szCs w:val="26"/>
+          <w:lang w:val="vi-VN"/>
+        </w:rPr>
+        <w:t>Unit</w:t>
+      </w:r>
+      <w:r>
+        <w:rPr>
+          <w:rFonts w:ascii="Times New Roman" w:eastAsia="Calibri" w:hAnsi="Times New Roman" w:cs="Times New Roman"/>
+          <w:bCs/>
+          <w:sz w:val="26"/>
+          <w:szCs w:val="26"/>
+        </w:rPr>
+        <w:t>s</w:t>
       </w:r>
     </w:p>
     <w:tbl>
@@ -21723,9 +21821,17 @@
                 <w:rFonts w:eastAsia="Calibri" w:cs="Times New Roman"/>
                 <w:bCs/>
                 <w:szCs w:val="26"/>
-                <w:lang w:val="en-US"/>
-              </w:rPr>
-              <w:t>LessonId</w:t>
+              </w:rPr>
+              <w:t>Unit</w:t>
+            </w:r>
+            <w:r>
+              <w:rPr>
+                <w:rFonts w:eastAsia="Calibri" w:cs="Times New Roman"/>
+                <w:bCs/>
+                <w:szCs w:val="26"/>
+                <w:lang w:val="en-US"/>
+              </w:rPr>
+              <w:t>Id</w:t>
             </w:r>
           </w:p>
         </w:tc>
@@ -21964,7 +22070,16 @@
                 <w:szCs w:val="26"/>
                 <w:lang w:val="en-US"/>
               </w:rPr>
-              <w:t xml:space="preserve">LessonName </w:t>
+              <w:t>Unit</w:t>
+            </w:r>
+            <w:r>
+              <w:rPr>
+                <w:rFonts w:eastAsia="Calibri" w:cs="Times New Roman"/>
+                <w:bCs/>
+                <w:szCs w:val="26"/>
+                <w:lang w:val="en-US"/>
+              </w:rPr>
+              <w:t xml:space="preserve">Name </w:t>
             </w:r>
           </w:p>
         </w:tc>
@@ -22068,9 +22183,8 @@
                 <w:rFonts w:eastAsia="Calibri" w:cs="Times New Roman"/>
                 <w:bCs/>
                 <w:szCs w:val="26"/>
-                <w:lang w:val="en-US"/>
-              </w:rPr>
-              <w:t>VideoUrl</w:t>
+              </w:rPr>
+              <w:t>Description</w:t>
             </w:r>
           </w:p>
         </w:tc>
@@ -22096,7 +22210,7 @@
                 <w:szCs w:val="26"/>
                 <w:lang w:val="en-US"/>
               </w:rPr>
-              <w:t>Nvarchar(50)</w:t>
+              <w:t>Nvarchar(255)</w:t>
             </w:r>
           </w:p>
         </w:tc>
@@ -22120,9 +22234,8 @@
                 <w:rFonts w:eastAsia="Calibri" w:cs="Times New Roman"/>
                 <w:bCs/>
                 <w:szCs w:val="26"/>
-                <w:lang w:val="en-US"/>
-              </w:rPr>
-              <w:t>Tên file video</w:t>
+              </w:rPr>
+              <w:t>Mô tả nội dung bài học</w:t>
             </w:r>
           </w:p>
         </w:tc>
@@ -22174,9 +22287,8 @@
                 <w:rFonts w:eastAsia="Calibri" w:cs="Times New Roman"/>
                 <w:bCs/>
                 <w:szCs w:val="26"/>
-                <w:lang w:val="en-US"/>
-              </w:rPr>
-              <w:t xml:space="preserve">Duration </w:t>
+              </w:rPr>
+              <w:t>Objective</w:t>
             </w:r>
           </w:p>
         </w:tc>
@@ -22200,9 +22312,8 @@
                 <w:rFonts w:eastAsia="Calibri" w:cs="Times New Roman"/>
                 <w:bCs/>
                 <w:szCs w:val="26"/>
-                <w:lang w:val="en-US"/>
-              </w:rPr>
-              <w:t xml:space="preserve">Int </w:t>
+              </w:rPr>
+              <w:t>Nvarchar(MAX)</w:t>
             </w:r>
           </w:p>
         </w:tc>
@@ -22226,18 +22337,8 @@
                 <w:rFonts w:eastAsia="Calibri" w:cs="Times New Roman"/>
                 <w:bCs/>
                 <w:szCs w:val="26"/>
-                <w:lang w:val="en-US"/>
-              </w:rPr>
-              <w:t>Thời lượng</w:t>
-            </w:r>
-            <w:r>
-              <w:rPr>
-                <w:rFonts w:eastAsia="Calibri" w:cs="Times New Roman"/>
-                <w:bCs/>
-                <w:szCs w:val="26"/>
-                <w:lang w:val="en-US"/>
-              </w:rPr>
-              <w:t xml:space="preserve"> video</w:t>
+              </w:rPr>
+              <w:t>Mục tiêu bài học</w:t>
             </w:r>
           </w:p>
         </w:tc>
@@ -22291,7 +22392,7 @@
                 <w:szCs w:val="26"/>
                 <w:lang w:val="en-US"/>
               </w:rPr>
-              <w:t xml:space="preserve">OrderIndex </w:t>
+              <w:t>VideoUrl</w:t>
             </w:r>
           </w:p>
         </w:tc>
@@ -22317,7 +22418,25 @@
                 <w:szCs w:val="26"/>
                 <w:lang w:val="en-US"/>
               </w:rPr>
-              <w:t xml:space="preserve">Int </w:t>
+              <w:t>Nvarchar(50</w:t>
+            </w:r>
+            <w:r>
+              <w:rPr>
+                <w:rFonts w:eastAsia="Calibri" w:cs="Times New Roman"/>
+                <w:bCs/>
+                <w:szCs w:val="26"/>
+                <w:lang w:val="en-US"/>
+              </w:rPr>
+              <w:t>0</w:t>
+            </w:r>
+            <w:r>
+              <w:rPr>
+                <w:rFonts w:eastAsia="Calibri" w:cs="Times New Roman"/>
+                <w:bCs/>
+                <w:szCs w:val="26"/>
+                <w:lang w:val="en-US"/>
+              </w:rPr>
+              <w:t>)</w:t>
             </w:r>
           </w:p>
         </w:tc>
@@ -22343,16 +22462,7 @@
                 <w:szCs w:val="26"/>
                 <w:lang w:val="en-US"/>
               </w:rPr>
-              <w:t>Thứ tự</w:t>
-            </w:r>
-            <w:r>
-              <w:rPr>
-                <w:rFonts w:eastAsia="Calibri" w:cs="Times New Roman"/>
-                <w:bCs/>
-                <w:szCs w:val="26"/>
-                <w:lang w:val="en-US"/>
-              </w:rPr>
-              <w:t xml:space="preserve"> bài học</w:t>
+              <w:t>Tên file video</w:t>
             </w:r>
           </w:p>
         </w:tc>
@@ -22381,6 +22491,443 @@
                 <w:lang w:val="en-US"/>
               </w:rPr>
               <w:t>7</w:t>
+            </w:r>
+          </w:p>
+        </w:tc>
+        <w:tc>
+          <w:tcPr>
+            <w:tcW w:w="2267" w:type="dxa"/>
+          </w:tcPr>
+          <w:p>
+            <w:pPr>
+              <w:spacing w:line="288" w:lineRule="auto"/>
+              <w:jc w:val="both"/>
+              <w:rPr>
+                <w:rFonts w:eastAsia="Calibri" w:cs="Times New Roman"/>
+                <w:bCs/>
+                <w:szCs w:val="26"/>
+                <w:lang w:val="en-US"/>
+              </w:rPr>
+            </w:pPr>
+            <w:r>
+              <w:rPr>
+                <w:rFonts w:eastAsia="Calibri" w:cs="Times New Roman"/>
+                <w:bCs/>
+                <w:szCs w:val="26"/>
+                <w:lang w:val="en-US"/>
+              </w:rPr>
+              <w:t xml:space="preserve">Duration </w:t>
+            </w:r>
+          </w:p>
+        </w:tc>
+        <w:tc>
+          <w:tcPr>
+            <w:tcW w:w="2409" w:type="dxa"/>
+          </w:tcPr>
+          <w:p>
+            <w:pPr>
+              <w:spacing w:line="288" w:lineRule="auto"/>
+              <w:jc w:val="both"/>
+              <w:rPr>
+                <w:rFonts w:eastAsia="Calibri" w:cs="Times New Roman"/>
+                <w:bCs/>
+                <w:szCs w:val="26"/>
+                <w:lang w:val="en-US"/>
+              </w:rPr>
+            </w:pPr>
+            <w:r>
+              <w:rPr>
+                <w:rFonts w:eastAsia="Calibri" w:cs="Times New Roman"/>
+                <w:bCs/>
+                <w:szCs w:val="26"/>
+                <w:lang w:val="en-US"/>
+              </w:rPr>
+              <w:t xml:space="preserve">Int </w:t>
+            </w:r>
+          </w:p>
+        </w:tc>
+        <w:tc>
+          <w:tcPr>
+            <w:tcW w:w="4011" w:type="dxa"/>
+          </w:tcPr>
+          <w:p>
+            <w:pPr>
+              <w:spacing w:line="288" w:lineRule="auto"/>
+              <w:jc w:val="both"/>
+              <w:rPr>
+                <w:rFonts w:eastAsia="Calibri" w:cs="Times New Roman"/>
+                <w:bCs/>
+                <w:szCs w:val="26"/>
+                <w:lang w:val="en-US"/>
+              </w:rPr>
+            </w:pPr>
+            <w:r>
+              <w:rPr>
+                <w:rFonts w:eastAsia="Calibri" w:cs="Times New Roman"/>
+                <w:bCs/>
+                <w:szCs w:val="26"/>
+                <w:lang w:val="en-US"/>
+              </w:rPr>
+              <w:t>Thời lượng</w:t>
+            </w:r>
+            <w:r>
+              <w:rPr>
+                <w:rFonts w:eastAsia="Calibri" w:cs="Times New Roman"/>
+                <w:bCs/>
+                <w:szCs w:val="26"/>
+                <w:lang w:val="en-US"/>
+              </w:rPr>
+              <w:t xml:space="preserve"> video</w:t>
+            </w:r>
+          </w:p>
+        </w:tc>
+      </w:tr>
+      <w:tr>
+        <w:tc>
+          <w:tcPr>
+            <w:tcW w:w="708" w:type="dxa"/>
+          </w:tcPr>
+          <w:p>
+            <w:pPr>
+              <w:spacing w:line="288" w:lineRule="auto"/>
+              <w:jc w:val="both"/>
+              <w:rPr>
+                <w:rFonts w:eastAsia="Calibri" w:cs="Times New Roman"/>
+                <w:bCs/>
+                <w:szCs w:val="26"/>
+                <w:lang w:val="en-US"/>
+              </w:rPr>
+            </w:pPr>
+            <w:r>
+              <w:rPr>
+                <w:rFonts w:eastAsia="Calibri" w:cs="Times New Roman"/>
+                <w:bCs/>
+                <w:szCs w:val="26"/>
+                <w:lang w:val="en-US"/>
+              </w:rPr>
+              <w:t>8</w:t>
+            </w:r>
+          </w:p>
+        </w:tc>
+        <w:tc>
+          <w:tcPr>
+            <w:tcW w:w="2267" w:type="dxa"/>
+          </w:tcPr>
+          <w:p>
+            <w:pPr>
+              <w:spacing w:line="288" w:lineRule="auto"/>
+              <w:jc w:val="both"/>
+              <w:rPr>
+                <w:rFonts w:eastAsia="Calibri" w:cs="Times New Roman"/>
+                <w:bCs/>
+                <w:szCs w:val="26"/>
+                <w:lang w:val="en-US"/>
+              </w:rPr>
+            </w:pPr>
+            <w:r>
+              <w:rPr>
+                <w:rFonts w:eastAsia="Calibri" w:cs="Times New Roman"/>
+                <w:bCs/>
+                <w:szCs w:val="26"/>
+                <w:lang w:val="en-US"/>
+              </w:rPr>
+              <w:t xml:space="preserve">OrderIndex </w:t>
+            </w:r>
+          </w:p>
+        </w:tc>
+        <w:tc>
+          <w:tcPr>
+            <w:tcW w:w="2409" w:type="dxa"/>
+          </w:tcPr>
+          <w:p>
+            <w:pPr>
+              <w:spacing w:line="288" w:lineRule="auto"/>
+              <w:jc w:val="both"/>
+              <w:rPr>
+                <w:rFonts w:eastAsia="Calibri" w:cs="Times New Roman"/>
+                <w:bCs/>
+                <w:szCs w:val="26"/>
+                <w:lang w:val="en-US"/>
+              </w:rPr>
+            </w:pPr>
+            <w:r>
+              <w:rPr>
+                <w:rFonts w:eastAsia="Calibri" w:cs="Times New Roman"/>
+                <w:bCs/>
+                <w:szCs w:val="26"/>
+                <w:lang w:val="en-US"/>
+              </w:rPr>
+              <w:t xml:space="preserve">Int </w:t>
+            </w:r>
+          </w:p>
+        </w:tc>
+        <w:tc>
+          <w:tcPr>
+            <w:tcW w:w="4011" w:type="dxa"/>
+          </w:tcPr>
+          <w:p>
+            <w:pPr>
+              <w:spacing w:line="288" w:lineRule="auto"/>
+              <w:jc w:val="both"/>
+              <w:rPr>
+                <w:rFonts w:eastAsia="Calibri" w:cs="Times New Roman"/>
+                <w:bCs/>
+                <w:szCs w:val="26"/>
+                <w:lang w:val="en-US"/>
+              </w:rPr>
+            </w:pPr>
+            <w:r>
+              <w:rPr>
+                <w:rFonts w:eastAsia="Calibri" w:cs="Times New Roman"/>
+                <w:bCs/>
+                <w:szCs w:val="26"/>
+                <w:lang w:val="en-US"/>
+              </w:rPr>
+              <w:t>Thứ tự</w:t>
+            </w:r>
+            <w:r>
+              <w:rPr>
+                <w:rFonts w:eastAsia="Calibri" w:cs="Times New Roman"/>
+                <w:bCs/>
+                <w:szCs w:val="26"/>
+                <w:lang w:val="en-US"/>
+              </w:rPr>
+              <w:t xml:space="preserve"> bài học</w:t>
+            </w:r>
+          </w:p>
+        </w:tc>
+      </w:tr>
+      <w:tr>
+        <w:tc>
+          <w:tcPr>
+            <w:tcW w:w="708" w:type="dxa"/>
+          </w:tcPr>
+          <w:p>
+            <w:pPr>
+              <w:spacing w:line="288" w:lineRule="auto"/>
+              <w:jc w:val="both"/>
+              <w:rPr>
+                <w:rFonts w:eastAsia="Calibri" w:cs="Times New Roman"/>
+                <w:bCs/>
+                <w:szCs w:val="26"/>
+                <w:lang w:val="en-US"/>
+              </w:rPr>
+            </w:pPr>
+            <w:r>
+              <w:rPr>
+                <w:rFonts w:eastAsia="Calibri" w:cs="Times New Roman"/>
+                <w:bCs/>
+                <w:szCs w:val="26"/>
+                <w:lang w:val="en-US"/>
+              </w:rPr>
+              <w:t>9</w:t>
+            </w:r>
+          </w:p>
+        </w:tc>
+        <w:tc>
+          <w:tcPr>
+            <w:tcW w:w="2267" w:type="dxa"/>
+          </w:tcPr>
+          <w:p>
+            <w:pPr>
+              <w:spacing w:line="288" w:lineRule="auto"/>
+              <w:jc w:val="both"/>
+              <w:rPr>
+                <w:rFonts w:eastAsia="Calibri" w:cs="Times New Roman"/>
+                <w:bCs/>
+                <w:szCs w:val="26"/>
+                <w:lang w:val="en-US"/>
+              </w:rPr>
+            </w:pPr>
+            <w:r>
+              <w:rPr>
+                <w:rFonts w:eastAsia="Calibri" w:cs="Times New Roman"/>
+                <w:bCs/>
+                <w:szCs w:val="26"/>
+              </w:rPr>
+              <w:t>CreatedDate</w:t>
+            </w:r>
+          </w:p>
+        </w:tc>
+        <w:tc>
+          <w:tcPr>
+            <w:tcW w:w="2409" w:type="dxa"/>
+          </w:tcPr>
+          <w:p>
+            <w:pPr>
+              <w:spacing w:line="288" w:lineRule="auto"/>
+              <w:jc w:val="both"/>
+              <w:rPr>
+                <w:rFonts w:eastAsia="Calibri" w:cs="Times New Roman"/>
+                <w:bCs/>
+                <w:szCs w:val="26"/>
+                <w:lang w:val="en-US"/>
+              </w:rPr>
+            </w:pPr>
+            <w:r>
+              <w:rPr>
+                <w:rFonts w:eastAsia="Calibri" w:cs="Times New Roman"/>
+                <w:bCs/>
+                <w:szCs w:val="26"/>
+              </w:rPr>
+              <w:t>DateTime</w:t>
+            </w:r>
+          </w:p>
+        </w:tc>
+        <w:tc>
+          <w:tcPr>
+            <w:tcW w:w="4011" w:type="dxa"/>
+          </w:tcPr>
+          <w:p>
+            <w:pPr>
+              <w:spacing w:line="288" w:lineRule="auto"/>
+              <w:jc w:val="both"/>
+              <w:rPr>
+                <w:rFonts w:eastAsia="Calibri" w:cs="Times New Roman"/>
+                <w:bCs/>
+                <w:szCs w:val="26"/>
+                <w:lang w:val="en-US"/>
+              </w:rPr>
+            </w:pPr>
+            <w:r>
+              <w:rPr>
+                <w:rFonts w:eastAsia="Calibri" w:cs="Times New Roman"/>
+                <w:bCs/>
+                <w:szCs w:val="26"/>
+              </w:rPr>
+              <w:t>Ngày tạo</w:t>
+            </w:r>
+          </w:p>
+        </w:tc>
+      </w:tr>
+      <w:tr>
+        <w:tc>
+          <w:tcPr>
+            <w:tcW w:w="708" w:type="dxa"/>
+          </w:tcPr>
+          <w:p>
+            <w:pPr>
+              <w:spacing w:line="288" w:lineRule="auto"/>
+              <w:jc w:val="both"/>
+              <w:rPr>
+                <w:rFonts w:eastAsia="Calibri" w:cs="Times New Roman"/>
+                <w:bCs/>
+                <w:szCs w:val="26"/>
+                <w:lang w:val="en-US"/>
+              </w:rPr>
+            </w:pPr>
+            <w:r>
+              <w:rPr>
+                <w:rFonts w:eastAsia="Calibri" w:cs="Times New Roman"/>
+                <w:bCs/>
+                <w:szCs w:val="26"/>
+                <w:lang w:val="en-US"/>
+              </w:rPr>
+              <w:t>10</w:t>
+            </w:r>
+          </w:p>
+        </w:tc>
+        <w:tc>
+          <w:tcPr>
+            <w:tcW w:w="2267" w:type="dxa"/>
+          </w:tcPr>
+          <w:p>
+            <w:pPr>
+              <w:spacing w:line="288" w:lineRule="auto"/>
+              <w:jc w:val="both"/>
+              <w:rPr>
+                <w:rFonts w:eastAsia="Calibri" w:cs="Times New Roman"/>
+                <w:bCs/>
+                <w:szCs w:val="26"/>
+                <w:lang w:val="en-US"/>
+              </w:rPr>
+            </w:pPr>
+            <w:r>
+              <w:rPr>
+                <w:rFonts w:eastAsia="Calibri" w:cs="Times New Roman"/>
+                <w:bCs/>
+                <w:szCs w:val="26"/>
+                <w:lang w:val="en-US"/>
+              </w:rPr>
+              <w:t xml:space="preserve">CreatedBy </w:t>
+            </w:r>
+          </w:p>
+        </w:tc>
+        <w:tc>
+          <w:tcPr>
+            <w:tcW w:w="2409" w:type="dxa"/>
+          </w:tcPr>
+          <w:p>
+            <w:pPr>
+              <w:spacing w:line="288" w:lineRule="auto"/>
+              <w:jc w:val="both"/>
+              <w:rPr>
+                <w:rFonts w:eastAsia="Calibri" w:cs="Times New Roman"/>
+                <w:bCs/>
+                <w:szCs w:val="26"/>
+              </w:rPr>
+            </w:pPr>
+            <w:r>
+              <w:rPr>
+                <w:rFonts w:eastAsia="Calibri" w:cs="Times New Roman"/>
+                <w:bCs/>
+                <w:szCs w:val="26"/>
+                <w:lang w:val="en-US"/>
+              </w:rPr>
+              <w:t>Nvarchar(255)</w:t>
+            </w:r>
+          </w:p>
+        </w:tc>
+        <w:tc>
+          <w:tcPr>
+            <w:tcW w:w="4011" w:type="dxa"/>
+          </w:tcPr>
+          <w:p>
+            <w:pPr>
+              <w:spacing w:line="288" w:lineRule="auto"/>
+              <w:jc w:val="both"/>
+              <w:rPr>
+                <w:rFonts w:eastAsia="Calibri" w:cs="Times New Roman"/>
+                <w:bCs/>
+                <w:szCs w:val="26"/>
+              </w:rPr>
+            </w:pPr>
+            <w:r>
+              <w:rPr>
+                <w:rFonts w:eastAsia="Calibri" w:cs="Times New Roman"/>
+                <w:bCs/>
+                <w:szCs w:val="26"/>
+                <w:lang w:val="en-US"/>
+              </w:rPr>
+              <w:t>Người tạo</w:t>
+            </w:r>
+          </w:p>
+        </w:tc>
+      </w:tr>
+      <w:tr>
+        <w:tc>
+          <w:tcPr>
+            <w:tcW w:w="708" w:type="dxa"/>
+          </w:tcPr>
+          <w:p>
+            <w:pPr>
+              <w:spacing w:line="288" w:lineRule="auto"/>
+              <w:jc w:val="both"/>
+              <w:rPr>
+                <w:rFonts w:eastAsia="Calibri" w:cs="Times New Roman"/>
+                <w:bCs/>
+                <w:szCs w:val="26"/>
+                <w:lang w:val="en-US"/>
+              </w:rPr>
+            </w:pPr>
+            <w:r>
+              <w:rPr>
+                <w:rFonts w:eastAsia="Calibri" w:cs="Times New Roman"/>
+                <w:bCs/>
+                <w:szCs w:val="26"/>
+                <w:lang w:val="en-US"/>
+              </w:rPr>
+              <w:t>11</w:t>
             </w:r>
           </w:p>
         </w:tc>
@@ -22822,7 +23369,16 @@
                 <w:szCs w:val="26"/>
                 <w:lang w:val="en-US"/>
               </w:rPr>
-              <w:t>LessonId</w:t>
+              <w:t>Unit</w:t>
+            </w:r>
+            <w:r>
+              <w:rPr>
+                <w:rFonts w:eastAsia="Calibri" w:cs="Times New Roman"/>
+                <w:bCs/>
+                <w:szCs w:val="26"/>
+                <w:lang w:val="en-US"/>
+              </w:rPr>
+              <w:t>Id</w:t>
             </w:r>
           </w:p>
         </w:tc>
@@ -23424,6 +23980,7 @@
                 <w:szCs w:val="26"/>
                 <w:lang w:val="en-US"/>
               </w:rPr>
+              <w:lastRenderedPageBreak/>
               <w:t>2</w:t>
             </w:r>
           </w:p>
@@ -23609,6 +24166,212 @@
                 <w:lang w:val="en-US"/>
               </w:rPr>
               <w:t>Nội dung đề bài</w:t>
+            </w:r>
+          </w:p>
+        </w:tc>
+      </w:tr>
+      <w:tr>
+        <w:tc>
+          <w:tcPr>
+            <w:tcW w:w="708" w:type="dxa"/>
+          </w:tcPr>
+          <w:p>
+            <w:pPr>
+              <w:spacing w:line="288" w:lineRule="auto"/>
+              <w:jc w:val="both"/>
+              <w:rPr>
+                <w:rFonts w:eastAsia="Calibri" w:cs="Times New Roman"/>
+                <w:bCs/>
+                <w:szCs w:val="26"/>
+                <w:lang w:val="en-US"/>
+              </w:rPr>
+            </w:pPr>
+            <w:r>
+              <w:rPr>
+                <w:rFonts w:eastAsia="Calibri" w:cs="Times New Roman"/>
+                <w:bCs/>
+                <w:szCs w:val="26"/>
+                <w:lang w:val="en-US"/>
+              </w:rPr>
+              <w:t>4</w:t>
+            </w:r>
+          </w:p>
+        </w:tc>
+        <w:tc>
+          <w:tcPr>
+            <w:tcW w:w="2267" w:type="dxa"/>
+          </w:tcPr>
+          <w:p>
+            <w:pPr>
+              <w:spacing w:line="288" w:lineRule="auto"/>
+              <w:jc w:val="both"/>
+              <w:rPr>
+                <w:rFonts w:eastAsia="Calibri" w:cs="Times New Roman"/>
+                <w:bCs/>
+                <w:szCs w:val="26"/>
+                <w:lang w:val="en-US"/>
+              </w:rPr>
+            </w:pPr>
+            <w:r>
+              <w:rPr>
+                <w:rFonts w:eastAsia="Calibri" w:cs="Times New Roman"/>
+                <w:bCs/>
+                <w:szCs w:val="26"/>
+              </w:rPr>
+              <w:t>ImageUrl</w:t>
+            </w:r>
+          </w:p>
+        </w:tc>
+        <w:tc>
+          <w:tcPr>
+            <w:tcW w:w="2409" w:type="dxa"/>
+          </w:tcPr>
+          <w:p>
+            <w:pPr>
+              <w:spacing w:line="288" w:lineRule="auto"/>
+              <w:jc w:val="both"/>
+              <w:rPr>
+                <w:rFonts w:eastAsia="Calibri" w:cs="Times New Roman"/>
+                <w:bCs/>
+                <w:szCs w:val="26"/>
+                <w:lang w:val="en-US"/>
+              </w:rPr>
+            </w:pPr>
+            <w:r>
+              <w:rPr>
+                <w:rFonts w:eastAsia="Calibri" w:cs="Times New Roman"/>
+                <w:bCs/>
+                <w:szCs w:val="26"/>
+              </w:rPr>
+              <w:t>Nvarchar(500)</w:t>
+            </w:r>
+          </w:p>
+        </w:tc>
+        <w:tc>
+          <w:tcPr>
+            <w:tcW w:w="4011" w:type="dxa"/>
+          </w:tcPr>
+          <w:p>
+            <w:pPr>
+              <w:spacing w:line="288" w:lineRule="auto"/>
+              <w:jc w:val="both"/>
+              <w:rPr>
+                <w:rFonts w:eastAsia="Calibri" w:cs="Times New Roman"/>
+                <w:bCs/>
+                <w:szCs w:val="26"/>
+                <w:lang w:val="en-US"/>
+              </w:rPr>
+            </w:pPr>
+            <w:r>
+              <w:rPr>
+                <w:rFonts w:eastAsia="Calibri" w:cs="Times New Roman"/>
+                <w:bCs/>
+                <w:szCs w:val="26"/>
+              </w:rPr>
+              <w:t>Lưu đường dẫn hoặc tên file ảnh minh họa</w:t>
+            </w:r>
+          </w:p>
+        </w:tc>
+      </w:tr>
+      <w:tr>
+        <w:tc>
+          <w:tcPr>
+            <w:tcW w:w="708" w:type="dxa"/>
+          </w:tcPr>
+          <w:p>
+            <w:pPr>
+              <w:spacing w:line="288" w:lineRule="auto"/>
+              <w:jc w:val="both"/>
+              <w:rPr>
+                <w:rFonts w:eastAsia="Calibri" w:cs="Times New Roman"/>
+                <w:bCs/>
+                <w:szCs w:val="26"/>
+                <w:lang w:val="en-US"/>
+              </w:rPr>
+            </w:pPr>
+            <w:r>
+              <w:rPr>
+                <w:rFonts w:eastAsia="Calibri" w:cs="Times New Roman"/>
+                <w:bCs/>
+                <w:szCs w:val="26"/>
+                <w:lang w:val="en-US"/>
+              </w:rPr>
+              <w:t>5</w:t>
+            </w:r>
+          </w:p>
+        </w:tc>
+        <w:tc>
+          <w:tcPr>
+            <w:tcW w:w="2267" w:type="dxa"/>
+          </w:tcPr>
+          <w:p>
+            <w:pPr>
+              <w:spacing w:line="288" w:lineRule="auto"/>
+              <w:jc w:val="both"/>
+              <w:rPr>
+                <w:rFonts w:eastAsia="Calibri" w:cs="Times New Roman"/>
+                <w:bCs/>
+                <w:szCs w:val="26"/>
+                <w:lang w:val="en-US"/>
+              </w:rPr>
+            </w:pPr>
+            <w:r>
+              <w:rPr>
+                <w:rFonts w:eastAsia="Calibri" w:cs="Times New Roman"/>
+                <w:bCs/>
+                <w:szCs w:val="26"/>
+              </w:rPr>
+              <w:t>AudioUrl</w:t>
+            </w:r>
+          </w:p>
+        </w:tc>
+        <w:tc>
+          <w:tcPr>
+            <w:tcW w:w="2409" w:type="dxa"/>
+          </w:tcPr>
+          <w:p>
+            <w:pPr>
+              <w:spacing w:line="288" w:lineRule="auto"/>
+              <w:jc w:val="both"/>
+              <w:rPr>
+                <w:rFonts w:eastAsia="Calibri" w:cs="Times New Roman"/>
+                <w:bCs/>
+                <w:szCs w:val="26"/>
+                <w:lang w:val="en-US"/>
+              </w:rPr>
+            </w:pPr>
+            <w:r>
+              <w:rPr>
+                <w:rFonts w:eastAsia="Calibri" w:cs="Times New Roman"/>
+                <w:bCs/>
+                <w:szCs w:val="26"/>
+              </w:rPr>
+              <w:t>Nvarchar(500)</w:t>
+            </w:r>
+          </w:p>
+        </w:tc>
+        <w:tc>
+          <w:tcPr>
+            <w:tcW w:w="4011" w:type="dxa"/>
+          </w:tcPr>
+          <w:p>
+            <w:pPr>
+              <w:spacing w:line="288" w:lineRule="auto"/>
+              <w:jc w:val="both"/>
+              <w:rPr>
+                <w:rFonts w:eastAsia="Calibri" w:cs="Times New Roman"/>
+                <w:bCs/>
+                <w:szCs w:val="26"/>
+                <w:lang w:val="en-US"/>
+              </w:rPr>
+            </w:pPr>
+            <w:r>
+              <w:rPr>
+                <w:rFonts w:eastAsia="Calibri" w:cs="Times New Roman"/>
+                <w:bCs/>
+                <w:szCs w:val="26"/>
+              </w:rPr>
+              <w:t>Lưu đường dẫn hoặc tên file âm thanh (mp3)</w:t>
             </w:r>
           </w:p>
         </w:tc>
@@ -23772,7 +24535,6 @@
                 <w:szCs w:val="26"/>
                 <w:lang w:val="en-US"/>
               </w:rPr>
-              <w:lastRenderedPageBreak/>
               <w:t>1</w:t>
             </w:r>
           </w:p>
@@ -24196,6 +24958,206 @@
                 <w:szCs w:val="26"/>
               </w:rPr>
               <w:t>Có phải đáp án đúng không</w:t>
+            </w:r>
+          </w:p>
+        </w:tc>
+      </w:tr>
+      <w:tr>
+        <w:tc>
+          <w:tcPr>
+            <w:tcW w:w="708" w:type="dxa"/>
+          </w:tcPr>
+          <w:p>
+            <w:pPr>
+              <w:spacing w:line="288" w:lineRule="auto"/>
+              <w:jc w:val="both"/>
+              <w:rPr>
+                <w:rFonts w:eastAsia="Calibri" w:cs="Times New Roman"/>
+                <w:bCs/>
+                <w:szCs w:val="26"/>
+                <w:lang w:val="en-US"/>
+              </w:rPr>
+            </w:pPr>
+            <w:r>
+              <w:rPr>
+                <w:rFonts w:eastAsia="Calibri" w:cs="Times New Roman"/>
+                <w:bCs/>
+                <w:szCs w:val="26"/>
+                <w:lang w:val="en-US"/>
+              </w:rPr>
+              <w:t>5</w:t>
+            </w:r>
+          </w:p>
+        </w:tc>
+        <w:tc>
+          <w:tcPr>
+            <w:tcW w:w="2267" w:type="dxa"/>
+          </w:tcPr>
+          <w:p>
+            <w:pPr>
+              <w:spacing w:line="288" w:lineRule="auto"/>
+              <w:jc w:val="both"/>
+              <w:rPr>
+                <w:rFonts w:eastAsia="Calibri" w:cs="Times New Roman"/>
+                <w:szCs w:val="26"/>
+                <w:lang w:val="en-US"/>
+              </w:rPr>
+            </w:pPr>
+            <w:r>
+              <w:rPr>
+                <w:rFonts w:eastAsia="Calibri" w:cs="Times New Roman"/>
+                <w:szCs w:val="26"/>
+              </w:rPr>
+              <w:t>ImageUrl</w:t>
+            </w:r>
+          </w:p>
+        </w:tc>
+        <w:tc>
+          <w:tcPr>
+            <w:tcW w:w="2409" w:type="dxa"/>
+          </w:tcPr>
+          <w:p>
+            <w:pPr>
+              <w:spacing w:line="288" w:lineRule="auto"/>
+              <w:jc w:val="both"/>
+              <w:rPr>
+                <w:rFonts w:eastAsia="Calibri" w:cs="Times New Roman"/>
+                <w:bCs/>
+                <w:szCs w:val="26"/>
+                <w:lang w:val="en-US"/>
+              </w:rPr>
+            </w:pPr>
+            <w:r>
+              <w:rPr>
+                <w:rFonts w:eastAsia="Calibri" w:cs="Times New Roman"/>
+                <w:bCs/>
+                <w:szCs w:val="26"/>
+              </w:rPr>
+              <w:t>Nvarchar(500)</w:t>
+            </w:r>
+          </w:p>
+        </w:tc>
+        <w:tc>
+          <w:tcPr>
+            <w:tcW w:w="4011" w:type="dxa"/>
+          </w:tcPr>
+          <w:p>
+            <w:pPr>
+              <w:spacing w:line="288" w:lineRule="auto"/>
+              <w:jc w:val="both"/>
+              <w:rPr>
+                <w:rFonts w:eastAsia="Calibri" w:cs="Times New Roman"/>
+                <w:bCs/>
+                <w:szCs w:val="26"/>
+              </w:rPr>
+            </w:pPr>
+            <w:r>
+              <w:rPr>
+                <w:rFonts w:eastAsia="Calibri" w:cs="Times New Roman"/>
+                <w:bCs/>
+                <w:szCs w:val="26"/>
+              </w:rPr>
+              <w:t>Ảnh cho đáp án (nếu có)</w:t>
+            </w:r>
+          </w:p>
+        </w:tc>
+      </w:tr>
+      <w:tr>
+        <w:tc>
+          <w:tcPr>
+            <w:tcW w:w="708" w:type="dxa"/>
+          </w:tcPr>
+          <w:p>
+            <w:pPr>
+              <w:spacing w:line="288" w:lineRule="auto"/>
+              <w:jc w:val="both"/>
+              <w:rPr>
+                <w:rFonts w:eastAsia="Calibri" w:cs="Times New Roman"/>
+                <w:bCs/>
+                <w:szCs w:val="26"/>
+                <w:lang w:val="en-US"/>
+              </w:rPr>
+            </w:pPr>
+            <w:r>
+              <w:rPr>
+                <w:rFonts w:eastAsia="Calibri" w:cs="Times New Roman"/>
+                <w:bCs/>
+                <w:szCs w:val="26"/>
+                <w:lang w:val="en-US"/>
+              </w:rPr>
+              <w:t>6</w:t>
+            </w:r>
+          </w:p>
+        </w:tc>
+        <w:tc>
+          <w:tcPr>
+            <w:tcW w:w="2267" w:type="dxa"/>
+          </w:tcPr>
+          <w:p>
+            <w:pPr>
+              <w:spacing w:line="288" w:lineRule="auto"/>
+              <w:jc w:val="both"/>
+              <w:rPr>
+                <w:rFonts w:eastAsia="Calibri" w:cs="Times New Roman"/>
+                <w:szCs w:val="26"/>
+                <w:lang w:val="en-US"/>
+              </w:rPr>
+            </w:pPr>
+            <w:r>
+              <w:rPr>
+                <w:rFonts w:eastAsia="Calibri" w:cs="Times New Roman"/>
+                <w:szCs w:val="26"/>
+              </w:rPr>
+              <w:t>AudioUrl</w:t>
+            </w:r>
+          </w:p>
+        </w:tc>
+        <w:tc>
+          <w:tcPr>
+            <w:tcW w:w="2409" w:type="dxa"/>
+          </w:tcPr>
+          <w:p>
+            <w:pPr>
+              <w:spacing w:line="288" w:lineRule="auto"/>
+              <w:jc w:val="both"/>
+              <w:rPr>
+                <w:rFonts w:eastAsia="Calibri" w:cs="Times New Roman"/>
+                <w:bCs/>
+                <w:szCs w:val="26"/>
+                <w:lang w:val="en-US"/>
+              </w:rPr>
+            </w:pPr>
+            <w:r>
+              <w:rPr>
+                <w:rFonts w:eastAsia="Calibri" w:cs="Times New Roman"/>
+                <w:bCs/>
+                <w:szCs w:val="26"/>
+              </w:rPr>
+              <w:t>Nvarchar(500)</w:t>
+            </w:r>
+          </w:p>
+        </w:tc>
+        <w:tc>
+          <w:tcPr>
+            <w:tcW w:w="4011" w:type="dxa"/>
+          </w:tcPr>
+          <w:p>
+            <w:pPr>
+              <w:spacing w:line="288" w:lineRule="auto"/>
+              <w:jc w:val="both"/>
+              <w:rPr>
+                <w:rFonts w:eastAsia="Calibri" w:cs="Times New Roman"/>
+                <w:bCs/>
+                <w:szCs w:val="26"/>
+              </w:rPr>
+            </w:pPr>
+            <w:r>
+              <w:rPr>
+                <w:rFonts w:eastAsia="Calibri" w:cs="Times New Roman"/>
+                <w:bCs/>
+                <w:szCs w:val="26"/>
+              </w:rPr>
+              <w:t>File âm thanh cho đáp án (nếu có)</w:t>
             </w:r>
           </w:p>
         </w:tc>
@@ -25457,7 +26419,16 @@
                 <w:szCs w:val="26"/>
                 <w:lang w:val="en-US"/>
               </w:rPr>
-              <w:t>LessonId</w:t>
+              <w:t>Unit</w:t>
+            </w:r>
+            <w:r>
+              <w:rPr>
+                <w:rFonts w:eastAsia="Calibri" w:cs="Times New Roman"/>
+                <w:bCs/>
+                <w:szCs w:val="26"/>
+                <w:lang w:val="en-US"/>
+              </w:rPr>
+              <w:t>Id</w:t>
             </w:r>
           </w:p>
         </w:tc>
@@ -25758,6 +26729,7 @@
                 <w:szCs w:val="26"/>
                 <w:lang w:val="en-US"/>
               </w:rPr>
+              <w:lastRenderedPageBreak/>
               <w:t>6</w:t>
             </w:r>
           </w:p>
@@ -26605,7 +27577,6 @@
                 <w:szCs w:val="26"/>
                 <w:lang w:val="en-US"/>
               </w:rPr>
-              <w:lastRenderedPageBreak/>
               <w:t>6</w:t>
             </w:r>
           </w:p>
@@ -27997,7 +28968,16 @@
                 <w:szCs w:val="26"/>
                 <w:lang w:val="en-US"/>
               </w:rPr>
-              <w:t>LessonId</w:t>
+              <w:t>Unit</w:t>
+            </w:r>
+            <w:r>
+              <w:rPr>
+                <w:rFonts w:eastAsia="Calibri" w:cs="Times New Roman"/>
+                <w:bCs/>
+                <w:szCs w:val="26"/>
+                <w:lang w:val="en-US"/>
+              </w:rPr>
+              <w:t>Id</w:t>
             </w:r>
           </w:p>
         </w:tc>
@@ -28239,6 +29219,7 @@
           <w:sz w:val="26"/>
           <w:szCs w:val="26"/>
         </w:rPr>
+        <w:lastRenderedPageBreak/>
         <w:t>Bảng</w:t>
       </w:r>
     </w:p>
@@ -28379,7 +29360,6 @@
       <w:bookmarkStart w:id="29" w:name="_Toc223961211"/>
       <w:bookmarkStart w:id="30" w:name="_Toc225768915"/>
       <w:r>
-        <w:lastRenderedPageBreak/>
         <w:t>Biểu đồ trường hợp sử dụng (Usecase Diagram)</w:t>
       </w:r>
       <w:bookmarkEnd w:id="29"/>
@@ -28403,7 +29383,16 @@
           <w:iCs/>
           <w:szCs w:val="26"/>
         </w:rPr>
-        <w:t>Sơ đồ Use Case được sử dụng để mô tả các chức năng chính của hệ thống và mối quan hệ tương tác giữa các tác nhân với hệ thống. Trong hệ thống học tiếng Việt cho người nước ngoài, các tác nhân bao gồm Guest, User và Admin, mỗi tác nhân sẽ thực hiện các chức năng khác nhau như xem khóa học, học bài, làm bài kiểm tra và quản lý hệ thống</w:t>
+        <w:t xml:space="preserve">Sơ đồ Use Case được sử dụng để mô tả các chức năng chính của hệ thống và mối quan hệ tương tác giữa các tác nhân với hệ thống. Trong hệ thống học tiếng Việt cho người nước ngoài, các tác nhân bao gồm Guest, User và Admin, mỗi tác nhân sẽ thực hiện các chức </w:t>
+      </w:r>
+      <w:r>
+        <w:rPr>
+          <w:rFonts w:cs="Times New Roman"/>
+          <w:iCs/>
+          <w:szCs w:val="26"/>
+        </w:rPr>
+        <w:lastRenderedPageBreak/>
+        <w:t>năng khác nhau như xem khóa học, học bài, làm bài kiểm tra và quản lý hệ thống</w:t>
       </w:r>
       <w:r>
         <w:rPr>
@@ -37412,11 +38401,207 @@
     </w:p>
     <w:p>
       <w:pPr>
+        <w:spacing w:line="288" w:lineRule="auto"/>
+        <w:jc w:val="both"/>
+        <w:rPr>
+          <w:rFonts w:cs="Times New Roman"/>
+          <w:szCs w:val="26"/>
+          <w:lang w:val="en-US"/>
+        </w:rPr>
+      </w:pPr>
+      <w:r>
+        <w:rPr>
+          <w:rFonts w:cs="Times New Roman"/>
+          <w:b/>
+          <w:bCs/>
+          <w:szCs w:val="26"/>
+          <w:lang w:val="en-US"/>
+        </w:rPr>
+        <w:lastRenderedPageBreak/>
+        <w:t>[3</w:t>
+      </w:r>
+      <w:r>
+        <w:rPr>
+          <w:rFonts w:cs="Times New Roman"/>
+          <w:b/>
+          <w:bCs/>
+          <w:szCs w:val="26"/>
+          <w:lang w:val="en-US"/>
+        </w:rPr>
+        <w:t>5</w:t>
+      </w:r>
+      <w:r>
+        <w:rPr>
+          <w:rFonts w:cs="Times New Roman"/>
+          <w:b/>
+          <w:bCs/>
+          <w:szCs w:val="26"/>
+          <w:lang w:val="en-US"/>
+        </w:rPr>
+        <w:t>] Bộ Giáo dục và Đào tạo (2015).</w:t>
+      </w:r>
+      <w:r>
+        <w:rPr>
+          <w:rFonts w:cs="Times New Roman"/>
+          <w:szCs w:val="26"/>
+          <w:lang w:val="en-US"/>
+        </w:rPr>
+        <w:t xml:space="preserve"> </w:t>
+      </w:r>
+      <w:r>
+        <w:rPr>
+          <w:rFonts w:cs="Times New Roman"/>
+          <w:i/>
+          <w:iCs/>
+          <w:szCs w:val="26"/>
+          <w:lang w:val="en-US"/>
+        </w:rPr>
+        <w:t>Thông tư số 17/2015/TT-BGDĐT ban hành Khung năng lực tiếng Việt dùng cho người nước ngoài.</w:t>
+      </w:r>
+    </w:p>
+    <w:p>
+      <w:pPr>
+        <w:spacing w:line="288" w:lineRule="auto"/>
+        <w:jc w:val="both"/>
+        <w:rPr>
+          <w:rFonts w:cs="Times New Roman"/>
+          <w:szCs w:val="26"/>
+          <w:lang w:val="en-US"/>
+        </w:rPr>
+      </w:pPr>
+      <w:r>
+        <w:rPr>
+          <w:rFonts w:cs="Times New Roman"/>
+          <w:b/>
+          <w:bCs/>
+          <w:szCs w:val="26"/>
+          <w:lang w:val="en-US"/>
+        </w:rPr>
+        <w:t>[3</w:t>
+      </w:r>
+      <w:r>
+        <w:rPr>
+          <w:rFonts w:cs="Times New Roman"/>
+          <w:b/>
+          <w:bCs/>
+          <w:szCs w:val="26"/>
+          <w:lang w:val="en-US"/>
+        </w:rPr>
+        <w:t>6</w:t>
+      </w:r>
+      <w:r>
+        <w:rPr>
+          <w:rFonts w:cs="Times New Roman"/>
+          <w:b/>
+          <w:bCs/>
+          <w:szCs w:val="26"/>
+          <w:lang w:val="en-US"/>
+        </w:rPr>
+        <w:t>] Khoa Việt Nam học, ĐH KHXH&amp;NV TP.HCM.</w:t>
+      </w:r>
+      <w:r>
+        <w:rPr>
+          <w:rFonts w:cs="Times New Roman"/>
+          <w:szCs w:val="26"/>
+          <w:lang w:val="en-US"/>
+        </w:rPr>
+        <w:t xml:space="preserve"> </w:t>
+      </w:r>
+      <w:r>
+        <w:rPr>
+          <w:rFonts w:cs="Times New Roman"/>
+          <w:i/>
+          <w:iCs/>
+          <w:szCs w:val="26"/>
+          <w:lang w:val="en-US"/>
+        </w:rPr>
+        <w:t>Giáo trình Tiếng Việt cho người nước ngoài (VSL 1, 2, 3).</w:t>
+      </w:r>
+    </w:p>
+    <w:p>
+      <w:pPr>
+        <w:spacing w:line="288" w:lineRule="auto"/>
+        <w:jc w:val="both"/>
+        <w:rPr>
+          <w:rFonts w:cs="Times New Roman"/>
+          <w:szCs w:val="26"/>
+          <w:lang w:val="en-US"/>
+        </w:rPr>
+      </w:pPr>
+      <w:r>
+        <w:rPr>
+          <w:rFonts w:cs="Times New Roman"/>
+          <w:b/>
+          <w:bCs/>
+          <w:szCs w:val="26"/>
+          <w:lang w:val="en-US"/>
+        </w:rPr>
+        <w:t>[3</w:t>
+      </w:r>
+      <w:r>
+        <w:rPr>
+          <w:rFonts w:cs="Times New Roman"/>
+          <w:b/>
+          <w:bCs/>
+          <w:szCs w:val="26"/>
+          <w:lang w:val="en-US"/>
+        </w:rPr>
+        <w:t>7</w:t>
+      </w:r>
+      <w:r>
+        <w:rPr>
+          <w:rFonts w:cs="Times New Roman"/>
+          <w:b/>
+          <w:bCs/>
+          <w:szCs w:val="26"/>
+          <w:lang w:val="en-US"/>
+        </w:rPr>
+        <w:t>] Nguyễn Anh Quế (Chủ biên).</w:t>
+      </w:r>
+      <w:r>
+        <w:rPr>
+          <w:rFonts w:cs="Times New Roman"/>
+          <w:szCs w:val="26"/>
+          <w:lang w:val="en-US"/>
+        </w:rPr>
+        <w:t xml:space="preserve"> </w:t>
+      </w:r>
+      <w:r>
+        <w:rPr>
+          <w:rFonts w:cs="Times New Roman"/>
+          <w:i/>
+          <w:iCs/>
+          <w:szCs w:val="26"/>
+          <w:lang w:val="en-US"/>
+        </w:rPr>
+        <w:t>Tiếng Việt Cơ Sở</w:t>
+      </w:r>
+      <w:r>
+        <w:rPr>
+          <w:rFonts w:cs="Times New Roman"/>
+          <w:szCs w:val="26"/>
+          <w:lang w:val="en-US"/>
+        </w:rPr>
+        <w:t>, Nhà xuất bản Đại học Quốc gia Hà Nội.</w:t>
+      </w:r>
+    </w:p>
+    <w:p>
+      <w:pPr>
+        <w:spacing w:line="288" w:lineRule="auto"/>
+        <w:jc w:val="both"/>
+        <w:rPr>
+          <w:rFonts w:cs="Times New Roman"/>
+          <w:szCs w:val="26"/>
+          <w:lang w:val="en-US"/>
+        </w:rPr>
+      </w:pPr>
+    </w:p>
+    <w:p>
+      <w:pPr>
         <w:pStyle w:val="Heading1"/>
       </w:pPr>
       <w:bookmarkStart w:id="49" w:name="_Toc225768929"/>
       <w:r>
-        <w:lastRenderedPageBreak/>
         <w:t>PHỤ LỤC</w:t>
       </w:r>
       <w:bookmarkEnd w:id="49"/>
@@ -38080,7 +39265,15 @@
                 <w:rFonts w:cs="Times New Roman"/>
                 <w:szCs w:val="26"/>
               </w:rPr>
-              <w:t xml:space="preserve"> and many special letters like </w:t>
+              <w:t xml:space="preserve"> and </w:t>
+            </w:r>
+            <w:r>
+              <w:rPr>
+                <w:rFonts w:cs="Times New Roman"/>
+                <w:szCs w:val="26"/>
+              </w:rPr>
+              <w:lastRenderedPageBreak/>
+              <w:t xml:space="preserve">many special letters like </w:t>
             </w:r>
             <w:r>
               <w:rPr>
@@ -38238,6 +39431,7 @@
                       <w:bCs/>
                       <w:szCs w:val="26"/>
                     </w:rPr>
+                    <w:lastRenderedPageBreak/>
                     <w:t xml:space="preserve">Câu </w:t>
                   </w:r>
                   <w:r>
@@ -38350,15 +39544,7 @@
                 <w:rFonts w:cs="Times New Roman"/>
                 <w:szCs w:val="26"/>
               </w:rPr>
-              <w:t xml:space="preserve">I usually search on Google or use a dictionary. However, most of the time it only shows a general meaning, which does not fully explain how the word is used in a </w:t>
-            </w:r>
-            <w:r>
-              <w:rPr>
-                <w:rFonts w:cs="Times New Roman"/>
-                <w:szCs w:val="26"/>
-              </w:rPr>
-              <w:lastRenderedPageBreak/>
-              <w:t>specific context.</w:t>
+              <w:t>I usually search on Google or use a dictionary. However, most of the time it only shows a general meaning, which does not fully explain how the word is used in a specific context.</w:t>
             </w:r>
             <w:r>
               <w:rPr>
@@ -38394,7 +39580,6 @@
                 <w:bCs/>
                 <w:szCs w:val="26"/>
               </w:rPr>
-              <w:lastRenderedPageBreak/>
               <w:t xml:space="preserve">Câu </w:t>
             </w:r>
             <w:r>
@@ -38625,7 +39810,15 @@
                 <w:rFonts w:cs="Times New Roman"/>
                 <w:szCs w:val="26"/>
               </w:rPr>
-              <w:t>I want a feature where I can enter a word and the system will show many videos containing that word. I can watch different videos to fully understand how the word is used and pronounced. In addition, I want to practice speaking and receive feedback on my pronunciation mistakes.</w:t>
+              <w:t xml:space="preserve">I want a feature where I can enter a word and the system will show many videos containing that word. I can watch different videos to fully understand how the word is used and pronounced. In addition, I want to </w:t>
+            </w:r>
+            <w:r>
+              <w:rPr>
+                <w:rFonts w:cs="Times New Roman"/>
+                <w:szCs w:val="26"/>
+              </w:rPr>
+              <w:lastRenderedPageBreak/>
+              <w:t>practice speaking and receive feedback on my pronunciation mistakes.</w:t>
             </w:r>
           </w:p>
         </w:tc>
@@ -38653,6 +39846,7 @@
           <w:szCs w:val="24"/>
           <w:lang w:val="en-US"/>
         </w:rPr>
+        <w:lastRenderedPageBreak/>
         <w:t xml:space="preserve">Bảng 1.1 </w:t>
       </w:r>
       <w:r>
@@ -38693,16 +39887,7 @@
           <w:bCs/>
           <w:szCs w:val="26"/>
         </w:rPr>
-        <w:t xml:space="preserve">Ngoài ra, để tìm hiểu nhu cầu học tiếng Việt theo hướng học tập bài bản thông qua giáo trình và lớp học, nhóm thực hiện đã tiến hành phỏng vấn một người nước ngoài đang theo học tiếng Việt tại trung tâm ngoại ngữ. Nội dung phỏng vấn tập trung vào phương pháp học theo giáo trình, những khó khăn trong quá trình học và nhu cầu đối với một hệ </w:t>
-      </w:r>
-      <w:r>
-        <w:rPr>
-          <w:rFonts w:cs="Times New Roman"/>
-          <w:bCs/>
-          <w:szCs w:val="26"/>
-        </w:rPr>
-        <w:lastRenderedPageBreak/>
-        <w:t>thống hỗ trợ học tiếng Việt trực tuyến. Kết quả phỏng vấn được trình bày trong Phiếu phỏng vấn người dùng dưới đây.</w:t>
+        <w:t>Ngoài ra, để tìm hiểu nhu cầu học tiếng Việt theo hướng học tập bài bản thông qua giáo trình và lớp học, nhóm thực hiện đã tiến hành phỏng vấn một người nước ngoài đang theo học tiếng Việt tại trung tâm ngoại ngữ. Nội dung phỏng vấn tập trung vào phương pháp học theo giáo trình, những khó khăn trong quá trình học và nhu cầu đối với một hệ thống hỗ trợ học tiếng Việt trực tuyến. Kết quả phỏng vấn được trình bày trong Phiếu phỏng vấn người dùng dưới đây.</w:t>
       </w:r>
     </w:p>
     <w:tbl>
@@ -39448,6 +40633,7 @@
                 <w:szCs w:val="26"/>
                 <w:lang w:val="en-US"/>
               </w:rPr>
+              <w:lastRenderedPageBreak/>
               <w:t xml:space="preserve">Câu 6: </w:t>
             </w:r>
             <w:r>
@@ -39601,15 +40787,7 @@
                 <w:rFonts w:cs="Times New Roman"/>
                 <w:szCs w:val="26"/>
               </w:rPr>
-              <w:t xml:space="preserve">I want the website to have lessons by level, grammar explanations, exercises, tests, and </w:t>
-            </w:r>
-            <w:r>
-              <w:rPr>
-                <w:rFonts w:cs="Times New Roman"/>
-                <w:szCs w:val="26"/>
-              </w:rPr>
-              <w:lastRenderedPageBreak/>
-              <w:t>speaking practice. I also want to track my learning progress.</w:t>
+              <w:t>I want the website to have lessons by level, grammar explanations, exercises, tests, and speaking practice. I also want to track my learning progress.</w:t>
             </w:r>
           </w:p>
         </w:tc>
@@ -39634,7 +40812,6 @@
           <w:szCs w:val="24"/>
           <w:lang w:val="en-US"/>
         </w:rPr>
-        <w:lastRenderedPageBreak/>
         <w:t xml:space="preserve">Bảng 1.2 </w:t>
       </w:r>
       <w:r>
@@ -40217,6 +41394,7 @@
                 <w:sz w:val="26"/>
                 <w:szCs w:val="26"/>
               </w:rPr>
+              <w:lastRenderedPageBreak/>
               <w:t>Người học hiện nay học tiếng Việt thông qua giáo trình, ứng dụng học ngôn ngữ, xem video, nghe nhạc và giao tiếp với người Việt.</w:t>
             </w:r>
           </w:p>
@@ -40330,7 +41508,6 @@
                 <w:sz w:val="26"/>
                 <w:szCs w:val="26"/>
               </w:rPr>
-              <w:lastRenderedPageBreak/>
               <w:t xml:space="preserve">Cần cung cấp video hội thoại và các tình huống giao tiếp trong đời sống hằng ngày. </w:t>
             </w:r>
           </w:p>
@@ -40928,6 +42105,7 @@
           <w:sz w:val="26"/>
           <w:szCs w:val="26"/>
         </w:rPr>
+        <w:lastRenderedPageBreak/>
         <w:t>Phương pháp khảo sát: S</w:t>
       </w:r>
       <w:r>
@@ -41093,7 +42271,6 @@
                 <w:szCs w:val="26"/>
                 <w:lang w:val="en-US"/>
               </w:rPr>
-              <w:lastRenderedPageBreak/>
               <w:t>Câu 1:</w:t>
             </w:r>
             <w:r>
@@ -41592,6 +42769,7 @@
                 <w:szCs w:val="26"/>
                 <w:lang w:val="en-US"/>
               </w:rPr>
+              <w:lastRenderedPageBreak/>
               <w:t>Câu 5:</w:t>
             </w:r>
             <w:r>
@@ -41728,7 +42906,6 @@
                 <w:szCs w:val="26"/>
                 <w:lang w:val="en-US"/>
               </w:rPr>
-              <w:lastRenderedPageBreak/>
               <w:t>Câu 6:</w:t>
             </w:r>
             <w:r>
@@ -48370,6 +49547,155 @@
     </w:lvl>
   </w:abstractNum>
   <w:abstractNum w:abstractNumId="32" w15:restartNumberingAfterBreak="0">
+    <w:nsid w:val="3ED658C7"/>
+    <w:multiLevelType w:val="multilevel"/>
+    <w:tmpl w:val="067061BE"/>
+    <w:lvl w:ilvl="0">
+      <w:start w:val="1"/>
+      <w:numFmt w:val="bullet"/>
+      <w:lvlText w:val=""/>
+      <w:lvlJc w:val="left"/>
+      <w:pPr>
+        <w:tabs>
+          <w:tab w:val="num" w:pos="720"/>
+        </w:tabs>
+        <w:ind w:left="720" w:hanging="360"/>
+      </w:pPr>
+      <w:rPr>
+        <w:rFonts w:ascii="Symbol" w:hAnsi="Symbol" w:hint="default"/>
+        <w:sz w:val="20"/>
+      </w:rPr>
+    </w:lvl>
+    <w:lvl w:ilvl="1" w:tentative="1">
+      <w:start w:val="1"/>
+      <w:numFmt w:val="bullet"/>
+      <w:lvlText w:val="o"/>
+      <w:lvlJc w:val="left"/>
+      <w:pPr>
+        <w:tabs>
+          <w:tab w:val="num" w:pos="1440"/>
+        </w:tabs>
+        <w:ind w:left="1440" w:hanging="360"/>
+      </w:pPr>
+      <w:rPr>
+        <w:rFonts w:ascii="Courier New" w:hAnsi="Courier New" w:hint="default"/>
+        <w:sz w:val="20"/>
+      </w:rPr>
+    </w:lvl>
+    <w:lvl w:ilvl="2" w:tentative="1">
+      <w:start w:val="1"/>
+      <w:numFmt w:val="bullet"/>
+      <w:lvlText w:val=""/>
+      <w:lvlJc w:val="left"/>
+      <w:pPr>
+        <w:tabs>
+          <w:tab w:val="num" w:pos="2160"/>
+        </w:tabs>
+        <w:ind w:left="2160" w:hanging="360"/>
+      </w:pPr>
+      <w:rPr>
+        <w:rFonts w:ascii="Wingdings" w:hAnsi="Wingdings" w:hint="default"/>
+        <w:sz w:val="20"/>
+      </w:rPr>
+    </w:lvl>
+    <w:lvl w:ilvl="3" w:tentative="1">
+      <w:start w:val="1"/>
+      <w:numFmt w:val="bullet"/>
+      <w:lvlText w:val=""/>
+      <w:lvlJc w:val="left"/>
+      <w:pPr>
+        <w:tabs>
+          <w:tab w:val="num" w:pos="2880"/>
+        </w:tabs>
+        <w:ind w:left="2880" w:hanging="360"/>
+      </w:pPr>
+      <w:rPr>
+        <w:rFonts w:ascii="Wingdings" w:hAnsi="Wingdings" w:hint="default"/>
+        <w:sz w:val="20"/>
+      </w:rPr>
+    </w:lvl>
+    <w:lvl w:ilvl="4" w:tentative="1">
+      <w:start w:val="1"/>
+      <w:numFmt w:val="bullet"/>
+      <w:lvlText w:val=""/>
+      <w:lvlJc w:val="left"/>
+      <w:pPr>
+        <w:tabs>
+          <w:tab w:val="num" w:pos="3600"/>
+        </w:tabs>
+        <w:ind w:left="3600" w:hanging="360"/>
+      </w:pPr>
+      <w:rPr>
+        <w:rFonts w:ascii="Wingdings" w:hAnsi="Wingdings" w:hint="default"/>
+        <w:sz w:val="20"/>
+      </w:rPr>
+    </w:lvl>
+    <w:lvl w:ilvl="5" w:tentative="1">
+      <w:start w:val="1"/>
+      <w:numFmt w:val="bullet"/>
+      <w:lvlText w:val=""/>
+      <w:lvlJc w:val="left"/>
+      <w:pPr>
+        <w:tabs>
+          <w:tab w:val="num" w:pos="4320"/>
+        </w:tabs>
+        <w:ind w:left="4320" w:hanging="360"/>
+      </w:pPr>
+      <w:rPr>
+        <w:rFonts w:ascii="Wingdings" w:hAnsi="Wingdings" w:hint="default"/>
+        <w:sz w:val="20"/>
+      </w:rPr>
+    </w:lvl>
+    <w:lvl w:ilvl="6" w:tentative="1">
+      <w:start w:val="1"/>
+      <w:numFmt w:val="bullet"/>
+      <w:lvlText w:val=""/>
+      <w:lvlJc w:val="left"/>
+      <w:pPr>
+        <w:tabs>
+          <w:tab w:val="num" w:pos="5040"/>
+        </w:tabs>
+        <w:ind w:left="5040" w:hanging="360"/>
+      </w:pPr>
+      <w:rPr>
+        <w:rFonts w:ascii="Wingdings" w:hAnsi="Wingdings" w:hint="default"/>
+        <w:sz w:val="20"/>
+      </w:rPr>
+    </w:lvl>
+    <w:lvl w:ilvl="7" w:tentative="1">
+      <w:start w:val="1"/>
+      <w:numFmt w:val="bullet"/>
+      <w:lvlText w:val=""/>
+      <w:lvlJc w:val="left"/>
+      <w:pPr>
+        <w:tabs>
+          <w:tab w:val="num" w:pos="5760"/>
+        </w:tabs>
+        <w:ind w:left="5760" w:hanging="360"/>
+      </w:pPr>
+      <w:rPr>
+        <w:rFonts w:ascii="Wingdings" w:hAnsi="Wingdings" w:hint="default"/>
+        <w:sz w:val="20"/>
+      </w:rPr>
+    </w:lvl>
+    <w:lvl w:ilvl="8" w:tentative="1">
+      <w:start w:val="1"/>
+      <w:numFmt w:val="bullet"/>
+      <w:lvlText w:val=""/>
+      <w:lvlJc w:val="left"/>
+      <w:pPr>
+        <w:tabs>
+          <w:tab w:val="num" w:pos="6480"/>
+        </w:tabs>
+        <w:ind w:left="6480" w:hanging="360"/>
+      </w:pPr>
+      <w:rPr>
+        <w:rFonts w:ascii="Wingdings" w:hAnsi="Wingdings" w:hint="default"/>
+        <w:sz w:val="20"/>
+      </w:rPr>
+    </w:lvl>
+  </w:abstractNum>
+  <w:abstractNum w:abstractNumId="33" w15:restartNumberingAfterBreak="0">
     <w:nsid w:val="3FB37ABD"/>
     <w:multiLevelType w:val="multilevel"/>
     <w:tmpl w:val="FED4C7E0"/>
@@ -48482,7 +49808,7 @@
       </w:rPr>
     </w:lvl>
   </w:abstractNum>
-  <w:abstractNum w:abstractNumId="33" w15:restartNumberingAfterBreak="0">
+  <w:abstractNum w:abstractNumId="34" w15:restartNumberingAfterBreak="0">
     <w:nsid w:val="41337E6F"/>
     <w:multiLevelType w:val="multilevel"/>
     <w:tmpl w:val="0F0EC730"/>
@@ -48626,7 +49952,7 @@
       </w:rPr>
     </w:lvl>
   </w:abstractNum>
-  <w:abstractNum w:abstractNumId="34" w15:restartNumberingAfterBreak="0">
+  <w:abstractNum w:abstractNumId="35" w15:restartNumberingAfterBreak="0">
     <w:nsid w:val="41C31946"/>
     <w:multiLevelType w:val="hybridMultilevel"/>
     <w:tmpl w:val="B1FA6872"/>
@@ -48739,7 +50065,7 @@
       </w:rPr>
     </w:lvl>
   </w:abstractNum>
-  <w:abstractNum w:abstractNumId="35" w15:restartNumberingAfterBreak="0">
+  <w:abstractNum w:abstractNumId="36" w15:restartNumberingAfterBreak="0">
     <w:nsid w:val="44DE3660"/>
     <w:multiLevelType w:val="multilevel"/>
     <w:tmpl w:val="5B100D84"/>
@@ -48888,7 +50214,7 @@
       </w:rPr>
     </w:lvl>
   </w:abstractNum>
-  <w:abstractNum w:abstractNumId="36" w15:restartNumberingAfterBreak="0">
+  <w:abstractNum w:abstractNumId="37" w15:restartNumberingAfterBreak="0">
     <w:nsid w:val="460F5DCD"/>
     <w:multiLevelType w:val="multilevel"/>
     <w:tmpl w:val="A1886134"/>
@@ -49001,7 +50327,7 @@
       </w:rPr>
     </w:lvl>
   </w:abstractNum>
-  <w:abstractNum w:abstractNumId="37" w15:restartNumberingAfterBreak="0">
+  <w:abstractNum w:abstractNumId="38" w15:restartNumberingAfterBreak="0">
     <w:nsid w:val="4672387A"/>
     <w:multiLevelType w:val="hybridMultilevel"/>
     <w:tmpl w:val="F16E9658"/>
@@ -49114,7 +50440,7 @@
       </w:rPr>
     </w:lvl>
   </w:abstractNum>
-  <w:abstractNum w:abstractNumId="38" w15:restartNumberingAfterBreak="0">
+  <w:abstractNum w:abstractNumId="39" w15:restartNumberingAfterBreak="0">
     <w:nsid w:val="48691F8A"/>
     <w:multiLevelType w:val="hybridMultilevel"/>
     <w:tmpl w:val="6B2E20D6"/>
@@ -49226,7 +50552,7 @@
       </w:rPr>
     </w:lvl>
   </w:abstractNum>
-  <w:abstractNum w:abstractNumId="39" w15:restartNumberingAfterBreak="0">
+  <w:abstractNum w:abstractNumId="40" w15:restartNumberingAfterBreak="0">
     <w:nsid w:val="4A573BB4"/>
     <w:multiLevelType w:val="hybridMultilevel"/>
     <w:tmpl w:val="5CCC6720"/>
@@ -49339,7 +50665,7 @@
       </w:rPr>
     </w:lvl>
   </w:abstractNum>
-  <w:abstractNum w:abstractNumId="40" w15:restartNumberingAfterBreak="0">
+  <w:abstractNum w:abstractNumId="41" w15:restartNumberingAfterBreak="0">
     <w:nsid w:val="4FCC1082"/>
     <w:multiLevelType w:val="hybridMultilevel"/>
     <w:tmpl w:val="E3302828"/>
@@ -49451,7 +50777,7 @@
       </w:rPr>
     </w:lvl>
   </w:abstractNum>
-  <w:abstractNum w:abstractNumId="41" w15:restartNumberingAfterBreak="0">
+  <w:abstractNum w:abstractNumId="42" w15:restartNumberingAfterBreak="0">
     <w:nsid w:val="519E739A"/>
     <w:multiLevelType w:val="hybridMultilevel"/>
     <w:tmpl w:val="49827F06"/>
@@ -49564,7 +50890,7 @@
       </w:rPr>
     </w:lvl>
   </w:abstractNum>
-  <w:abstractNum w:abstractNumId="42" w15:restartNumberingAfterBreak="0">
+  <w:abstractNum w:abstractNumId="43" w15:restartNumberingAfterBreak="0">
     <w:nsid w:val="53301CC2"/>
     <w:multiLevelType w:val="hybridMultilevel"/>
     <w:tmpl w:val="2CC6EE6A"/>
@@ -49676,7 +51002,7 @@
       </w:rPr>
     </w:lvl>
   </w:abstractNum>
-  <w:abstractNum w:abstractNumId="43" w15:restartNumberingAfterBreak="0">
+  <w:abstractNum w:abstractNumId="44" w15:restartNumberingAfterBreak="0">
     <w:nsid w:val="5C364961"/>
     <w:multiLevelType w:val="hybridMultilevel"/>
     <w:tmpl w:val="91980380"/>
@@ -49789,7 +51115,7 @@
       </w:rPr>
     </w:lvl>
   </w:abstractNum>
-  <w:abstractNum w:abstractNumId="44" w15:restartNumberingAfterBreak="0">
+  <w:abstractNum w:abstractNumId="45" w15:restartNumberingAfterBreak="0">
     <w:nsid w:val="612928F6"/>
     <w:multiLevelType w:val="hybridMultilevel"/>
     <w:tmpl w:val="643856EC"/>
@@ -49902,7 +51228,7 @@
       </w:rPr>
     </w:lvl>
   </w:abstractNum>
-  <w:abstractNum w:abstractNumId="45" w15:restartNumberingAfterBreak="0">
+  <w:abstractNum w:abstractNumId="46" w15:restartNumberingAfterBreak="0">
     <w:nsid w:val="62D00F4C"/>
     <w:multiLevelType w:val="hybridMultilevel"/>
     <w:tmpl w:val="F260F846"/>
@@ -50015,7 +51341,7 @@
       </w:rPr>
     </w:lvl>
   </w:abstractNum>
-  <w:abstractNum w:abstractNumId="46" w15:restartNumberingAfterBreak="0">
+  <w:abstractNum w:abstractNumId="47" w15:restartNumberingAfterBreak="0">
     <w:nsid w:val="638E1A78"/>
     <w:multiLevelType w:val="hybridMultilevel"/>
     <w:tmpl w:val="68CA940C"/>
@@ -50128,7 +51454,7 @@
       </w:rPr>
     </w:lvl>
   </w:abstractNum>
-  <w:abstractNum w:abstractNumId="47" w15:restartNumberingAfterBreak="0">
+  <w:abstractNum w:abstractNumId="48" w15:restartNumberingAfterBreak="0">
     <w:nsid w:val="650E11EC"/>
     <w:multiLevelType w:val="hybridMultilevel"/>
     <w:tmpl w:val="7644AD98"/>
@@ -50241,7 +51567,7 @@
       </w:rPr>
     </w:lvl>
   </w:abstractNum>
-  <w:abstractNum w:abstractNumId="48" w15:restartNumberingAfterBreak="0">
+  <w:abstractNum w:abstractNumId="49" w15:restartNumberingAfterBreak="0">
     <w:nsid w:val="6AA86B0F"/>
     <w:multiLevelType w:val="hybridMultilevel"/>
     <w:tmpl w:val="F7621FD8"/>
@@ -50354,7 +51680,7 @@
       </w:rPr>
     </w:lvl>
   </w:abstractNum>
-  <w:abstractNum w:abstractNumId="49" w15:restartNumberingAfterBreak="0">
+  <w:abstractNum w:abstractNumId="50" w15:restartNumberingAfterBreak="0">
     <w:nsid w:val="6EF217BE"/>
     <w:multiLevelType w:val="hybridMultilevel"/>
     <w:tmpl w:val="75F0DB90"/>
@@ -50467,7 +51793,7 @@
       </w:rPr>
     </w:lvl>
   </w:abstractNum>
-  <w:abstractNum w:abstractNumId="50" w15:restartNumberingAfterBreak="0">
+  <w:abstractNum w:abstractNumId="51" w15:restartNumberingAfterBreak="0">
     <w:nsid w:val="6F247955"/>
     <w:multiLevelType w:val="multilevel"/>
     <w:tmpl w:val="3BA22750"/>
@@ -50581,7 +51907,7 @@
       </w:rPr>
     </w:lvl>
   </w:abstractNum>
-  <w:abstractNum w:abstractNumId="51" w15:restartNumberingAfterBreak="0">
+  <w:abstractNum w:abstractNumId="52" w15:restartNumberingAfterBreak="0">
     <w:nsid w:val="704C65FB"/>
     <w:multiLevelType w:val="hybridMultilevel"/>
     <w:tmpl w:val="24F077EE"/>
@@ -50694,7 +52020,7 @@
       </w:rPr>
     </w:lvl>
   </w:abstractNum>
-  <w:abstractNum w:abstractNumId="52" w15:restartNumberingAfterBreak="0">
+  <w:abstractNum w:abstractNumId="53" w15:restartNumberingAfterBreak="0">
     <w:nsid w:val="72062DD3"/>
     <w:multiLevelType w:val="hybridMultilevel"/>
     <w:tmpl w:val="7FAC846A"/>
@@ -50807,7 +52133,7 @@
       </w:rPr>
     </w:lvl>
   </w:abstractNum>
-  <w:abstractNum w:abstractNumId="53" w15:restartNumberingAfterBreak="0">
+  <w:abstractNum w:abstractNumId="54" w15:restartNumberingAfterBreak="0">
     <w:nsid w:val="727530DB"/>
     <w:multiLevelType w:val="hybridMultilevel"/>
     <w:tmpl w:val="15A24198"/>
@@ -50920,7 +52246,7 @@
       </w:rPr>
     </w:lvl>
   </w:abstractNum>
-  <w:abstractNum w:abstractNumId="54" w15:restartNumberingAfterBreak="0">
+  <w:abstractNum w:abstractNumId="55" w15:restartNumberingAfterBreak="0">
     <w:nsid w:val="75132C1E"/>
     <w:multiLevelType w:val="hybridMultilevel"/>
     <w:tmpl w:val="7A02293A"/>
@@ -51033,7 +52359,7 @@
       </w:rPr>
     </w:lvl>
   </w:abstractNum>
-  <w:abstractNum w:abstractNumId="55" w15:restartNumberingAfterBreak="0">
+  <w:abstractNum w:abstractNumId="56" w15:restartNumberingAfterBreak="0">
     <w:nsid w:val="75FD2C39"/>
     <w:multiLevelType w:val="hybridMultilevel"/>
     <w:tmpl w:val="9B967342"/>
@@ -51145,7 +52471,7 @@
       </w:rPr>
     </w:lvl>
   </w:abstractNum>
-  <w:abstractNum w:abstractNumId="56" w15:restartNumberingAfterBreak="0">
+  <w:abstractNum w:abstractNumId="57" w15:restartNumberingAfterBreak="0">
     <w:nsid w:val="76091847"/>
     <w:multiLevelType w:val="hybridMultilevel"/>
     <w:tmpl w:val="1586118A"/>
@@ -51257,7 +52583,7 @@
       </w:rPr>
     </w:lvl>
   </w:abstractNum>
-  <w:abstractNum w:abstractNumId="57" w15:restartNumberingAfterBreak="0">
+  <w:abstractNum w:abstractNumId="58" w15:restartNumberingAfterBreak="0">
     <w:nsid w:val="7D545DAE"/>
     <w:multiLevelType w:val="hybridMultilevel"/>
     <w:tmpl w:val="5CC20F4C"/>
@@ -51370,7 +52696,7 @@
       </w:rPr>
     </w:lvl>
   </w:abstractNum>
-  <w:abstractNum w:abstractNumId="58" w15:restartNumberingAfterBreak="0">
+  <w:abstractNum w:abstractNumId="59" w15:restartNumberingAfterBreak="0">
     <w:nsid w:val="7D99326D"/>
     <w:multiLevelType w:val="hybridMultilevel"/>
     <w:tmpl w:val="A306B660"/>
@@ -51490,13 +52816,13 @@
     <w:abstractNumId w:val="3"/>
   </w:num>
   <w:num w:numId="3" w16cid:durableId="897130636">
-    <w:abstractNumId w:val="45"/>
+    <w:abstractNumId w:val="46"/>
   </w:num>
   <w:num w:numId="4" w16cid:durableId="318656298">
-    <w:abstractNumId w:val="41"/>
+    <w:abstractNumId w:val="42"/>
   </w:num>
   <w:num w:numId="5" w16cid:durableId="1659191675">
-    <w:abstractNumId w:val="34"/>
+    <w:abstractNumId w:val="35"/>
   </w:num>
   <w:num w:numId="6" w16cid:durableId="46802583">
     <w:abstractNumId w:val="19"/>
@@ -51517,10 +52843,10 @@
     <w:abstractNumId w:val="10"/>
   </w:num>
   <w:num w:numId="12" w16cid:durableId="452138306">
-    <w:abstractNumId w:val="39"/>
+    <w:abstractNumId w:val="40"/>
   </w:num>
   <w:num w:numId="13" w16cid:durableId="748962524">
-    <w:abstractNumId w:val="37"/>
+    <w:abstractNumId w:val="38"/>
   </w:num>
   <w:num w:numId="14" w16cid:durableId="1586457234">
     <w:abstractNumId w:val="28"/>
@@ -51529,28 +52855,28 @@
     <w:abstractNumId w:val="15"/>
   </w:num>
   <w:num w:numId="16" w16cid:durableId="1269001189">
-    <w:abstractNumId w:val="58"/>
+    <w:abstractNumId w:val="59"/>
   </w:num>
   <w:num w:numId="17" w16cid:durableId="1911234658">
-    <w:abstractNumId w:val="35"/>
+    <w:abstractNumId w:val="36"/>
   </w:num>
   <w:num w:numId="18" w16cid:durableId="1276906059">
-    <w:abstractNumId w:val="36"/>
+    <w:abstractNumId w:val="37"/>
   </w:num>
   <w:num w:numId="19" w16cid:durableId="329451955">
-    <w:abstractNumId w:val="40"/>
+    <w:abstractNumId w:val="41"/>
   </w:num>
   <w:num w:numId="20" w16cid:durableId="1074282523">
-    <w:abstractNumId w:val="33"/>
+    <w:abstractNumId w:val="34"/>
   </w:num>
   <w:num w:numId="21" w16cid:durableId="965307312">
     <w:abstractNumId w:val="1"/>
   </w:num>
   <w:num w:numId="22" w16cid:durableId="1071851362">
-    <w:abstractNumId w:val="32"/>
+    <w:abstractNumId w:val="33"/>
   </w:num>
   <w:num w:numId="23" w16cid:durableId="1175152526">
-    <w:abstractNumId w:val="49"/>
+    <w:abstractNumId w:val="50"/>
   </w:num>
   <w:num w:numId="24" w16cid:durableId="275528137">
     <w:abstractNumId w:val="4"/>
@@ -51559,31 +52885,31 @@
     <w:abstractNumId w:val="11"/>
   </w:num>
   <w:num w:numId="26" w16cid:durableId="1749381604">
-    <w:abstractNumId w:val="54"/>
+    <w:abstractNumId w:val="55"/>
   </w:num>
   <w:num w:numId="27" w16cid:durableId="1520045983">
+    <w:abstractNumId w:val="49"/>
+  </w:num>
+  <w:num w:numId="28" w16cid:durableId="1691253914">
     <w:abstractNumId w:val="48"/>
   </w:num>
-  <w:num w:numId="28" w16cid:durableId="1691253914">
-    <w:abstractNumId w:val="47"/>
-  </w:num>
   <w:num w:numId="29" w16cid:durableId="900604672">
-    <w:abstractNumId w:val="50"/>
+    <w:abstractNumId w:val="51"/>
   </w:num>
   <w:num w:numId="30" w16cid:durableId="480080184">
-    <w:abstractNumId w:val="42"/>
+    <w:abstractNumId w:val="43"/>
   </w:num>
   <w:num w:numId="31" w16cid:durableId="2028292477">
-    <w:abstractNumId w:val="56"/>
+    <w:abstractNumId w:val="57"/>
   </w:num>
   <w:num w:numId="32" w16cid:durableId="529685352">
-    <w:abstractNumId w:val="51"/>
+    <w:abstractNumId w:val="52"/>
   </w:num>
   <w:num w:numId="33" w16cid:durableId="163323672">
     <w:abstractNumId w:val="8"/>
   </w:num>
   <w:num w:numId="34" w16cid:durableId="905798328">
-    <w:abstractNumId w:val="53"/>
+    <w:abstractNumId w:val="54"/>
   </w:num>
   <w:num w:numId="35" w16cid:durableId="1652128179">
     <w:abstractNumId w:val="9"/>
@@ -51598,19 +52924,19 @@
     <w:abstractNumId w:val="25"/>
   </w:num>
   <w:num w:numId="39" w16cid:durableId="1543978944">
-    <w:abstractNumId w:val="43"/>
+    <w:abstractNumId w:val="44"/>
   </w:num>
   <w:num w:numId="40" w16cid:durableId="942299264">
-    <w:abstractNumId w:val="57"/>
+    <w:abstractNumId w:val="58"/>
   </w:num>
   <w:num w:numId="41" w16cid:durableId="1315256194">
     <w:abstractNumId w:val="26"/>
   </w:num>
   <w:num w:numId="42" w16cid:durableId="2140368812">
-    <w:abstractNumId w:val="46"/>
+    <w:abstractNumId w:val="47"/>
   </w:num>
   <w:num w:numId="43" w16cid:durableId="41366019">
-    <w:abstractNumId w:val="44"/>
+    <w:abstractNumId w:val="45"/>
   </w:num>
   <w:num w:numId="44" w16cid:durableId="1479764653">
     <w:abstractNumId w:val="20"/>
@@ -51619,13 +52945,13 @@
     <w:abstractNumId w:val="29"/>
   </w:num>
   <w:num w:numId="46" w16cid:durableId="167866661">
-    <w:abstractNumId w:val="55"/>
+    <w:abstractNumId w:val="56"/>
   </w:num>
   <w:num w:numId="47" w16cid:durableId="1393234792">
     <w:abstractNumId w:val="14"/>
   </w:num>
   <w:num w:numId="48" w16cid:durableId="2116710112">
-    <w:abstractNumId w:val="38"/>
+    <w:abstractNumId w:val="39"/>
   </w:num>
   <w:num w:numId="49" w16cid:durableId="1776440318">
     <w:abstractNumId w:val="7"/>
@@ -51652,13 +52978,16 @@
     <w:abstractNumId w:val="24"/>
   </w:num>
   <w:num w:numId="57" w16cid:durableId="1101147485">
-    <w:abstractNumId w:val="52"/>
+    <w:abstractNumId w:val="53"/>
   </w:num>
   <w:num w:numId="58" w16cid:durableId="1893955882">
     <w:abstractNumId w:val="12"/>
   </w:num>
   <w:num w:numId="59" w16cid:durableId="1777023047">
     <w:abstractNumId w:val="27"/>
+  </w:num>
+  <w:num w:numId="60" w16cid:durableId="241568819">
+    <w:abstractNumId w:val="32"/>
   </w:num>
   <w:numIdMacAtCleanup w:val="58"/>
 </w:numbering>

</xml_diff>